<commit_message>
Add pre/post-by-day tables per variable to the amplitude DOCX
New Section 5 with one pre-vs-post table per variable (Vigor, Fadiga BRUMS,
TMD, Fadiga mental), broken down by day of the microcycle: pre and post
mean ± SD, delta (post-pre), paired dz, and athlete-paired Wilcoxon p, with
HIIT days and significance flagged. Adds a 2x2 pre/post bar figure (adx6)
marking significant days. Downstream sections and table/figure numbering
updated (now 11 tables, 6 figures).

The acute pre->post response is largest on Day 1 and in the back half of the
week; most single days do not reach paired significance, reinforcing that the
robust signal is the weekly accumulation, not the isolated session.

Reproducible: scripts/analise/prepost_compute.py, build_amp_docx.py.
Athletes anonymized; no raw data committed.

Co-Authored-By: Claude Opus 4.8 <noreply@anthropic.com>
Claude-Session: https://claude.ai/code/session_01P7yGiDeoGDyjWvPWQVsUrj
</commit_message>
<xml_diff>
--- a/Artigos/Amplitude_Ruido_Sinal_Vigor_Fadiga_TMD.docx
+++ b/Artigos/Amplitude_Ruido_Sinal_Vigor_Fadiga_TMD.docx
@@ -3078,7 +3078,16 @@
         <w:pStyle w:val="Heading1"/>
       </w:pPr>
       <w:r>
-        <w:t>5. Veredito em dois níveis — grupo vs indivíduo</w:t>
+        <w:t>5. Pré e pós por dia — cada variável</w:t>
+      </w:r>
+    </w:p>
+    <w:p>
+      <w:r>
+        <w:rPr>
+          <w:b w:val="0"/>
+          <w:i w:val="0"/>
+        </w:rPr>
+        <w:t>Resposta aguda dentro de cada dia: média ± DP de pré e pós, variação Δ (pós−pré), tamanho de efeito pareado dz e Wilcoxon pareado por atleta. Dias de HIIT: 2, 4 e 7. Valores em negrito de p indicam significância (p&lt;0,05).</w:t>
       </w:r>
     </w:p>
     <w:p>
@@ -3087,7 +3096,3187 @@
           <w:b/>
           <w:sz w:val="19"/>
         </w:rPr>
-        <w:t>Tabela 6 — A oscilação semanal supera o ruído?</w:t>
+        <w:t>Tabela 6 — Vigor (0–20): pré vs pós por dia</w:t>
+      </w:r>
+    </w:p>
+    <w:tbl>
+      <w:tblPr>
+        <w:tblStyle w:val="LightGrid-Accent1"/>
+        <w:tblW w:type="auto" w:w="0"/>
+        <w:jc w:val="center"/>
+        <w:tblLook w:firstColumn="1" w:firstRow="1" w:lastColumn="0" w:lastRow="0" w:noHBand="0" w:noVBand="1" w:val="04A0"/>
+      </w:tblPr>
+      <w:tblGrid>
+        <w:gridCol w:w="1234"/>
+        <w:gridCol w:w="1234"/>
+        <w:gridCol w:w="1234"/>
+        <w:gridCol w:w="1234"/>
+        <w:gridCol w:w="1234"/>
+        <w:gridCol w:w="1234"/>
+        <w:gridCol w:w="1234"/>
+      </w:tblGrid>
+      <w:tr>
+        <w:tc>
+          <w:tcPr>
+            <w:tcW w:type="dxa" w:w="1234"/>
+          </w:tcPr>
+          <w:p>
+            <w:r>
+              <w:rPr>
+                <w:b/>
+                <w:sz w:val="17"/>
+              </w:rPr>
+              <w:t>Dia</w:t>
+            </w:r>
+          </w:p>
+        </w:tc>
+        <w:tc>
+          <w:tcPr>
+            <w:tcW w:type="dxa" w:w="1234"/>
+          </w:tcPr>
+          <w:p>
+            <w:r>
+              <w:rPr>
+                <w:b/>
+                <w:sz w:val="17"/>
+              </w:rPr>
+              <w:t>Pré (m ± DP)</w:t>
+            </w:r>
+          </w:p>
+        </w:tc>
+        <w:tc>
+          <w:tcPr>
+            <w:tcW w:type="dxa" w:w="1234"/>
+          </w:tcPr>
+          <w:p>
+            <w:r>
+              <w:rPr>
+                <w:b/>
+                <w:sz w:val="17"/>
+              </w:rPr>
+              <w:t>Pós (m ± DP)</w:t>
+            </w:r>
+          </w:p>
+        </w:tc>
+        <w:tc>
+          <w:tcPr>
+            <w:tcW w:type="dxa" w:w="1234"/>
+          </w:tcPr>
+          <w:p>
+            <w:r>
+              <w:rPr>
+                <w:b/>
+                <w:sz w:val="17"/>
+              </w:rPr>
+              <w:t>Δ (pós−pré)</w:t>
+            </w:r>
+          </w:p>
+        </w:tc>
+        <w:tc>
+          <w:tcPr>
+            <w:tcW w:type="dxa" w:w="1234"/>
+          </w:tcPr>
+          <w:p>
+            <w:r>
+              <w:rPr>
+                <w:b/>
+                <w:sz w:val="17"/>
+              </w:rPr>
+              <w:t>dz</w:t>
+            </w:r>
+          </w:p>
+        </w:tc>
+        <w:tc>
+          <w:tcPr>
+            <w:tcW w:type="dxa" w:w="1234"/>
+          </w:tcPr>
+          <w:p>
+            <w:r>
+              <w:rPr>
+                <w:b/>
+                <w:sz w:val="17"/>
+              </w:rPr>
+              <w:t>p (Wilcoxon)</w:t>
+            </w:r>
+          </w:p>
+        </w:tc>
+        <w:tc>
+          <w:tcPr>
+            <w:tcW w:type="dxa" w:w="1234"/>
+          </w:tcPr>
+          <w:p>
+            <w:r>
+              <w:rPr>
+                <w:b/>
+                <w:sz w:val="17"/>
+              </w:rPr>
+              <w:t>n pares</w:t>
+            </w:r>
+          </w:p>
+        </w:tc>
+      </w:tr>
+      <w:tr>
+        <w:tc>
+          <w:tcPr>
+            <w:tcW w:type="dxa" w:w="1234"/>
+          </w:tcPr>
+          <w:p>
+            <w:r>
+              <w:rPr>
+                <w:sz w:val="17"/>
+              </w:rPr>
+              <w:t>D1</w:t>
+            </w:r>
+          </w:p>
+        </w:tc>
+        <w:tc>
+          <w:tcPr>
+            <w:tcW w:type="dxa" w:w="1234"/>
+          </w:tcPr>
+          <w:p>
+            <w:r>
+              <w:rPr>
+                <w:sz w:val="17"/>
+              </w:rPr>
+              <w:t>8.30 ± 3.57</w:t>
+            </w:r>
+          </w:p>
+        </w:tc>
+        <w:tc>
+          <w:tcPr>
+            <w:tcW w:type="dxa" w:w="1234"/>
+          </w:tcPr>
+          <w:p>
+            <w:r>
+              <w:rPr>
+                <w:sz w:val="17"/>
+              </w:rPr>
+              <w:t>6.13 ± 3.34</w:t>
+            </w:r>
+          </w:p>
+        </w:tc>
+        <w:tc>
+          <w:tcPr>
+            <w:tcW w:type="dxa" w:w="1234"/>
+          </w:tcPr>
+          <w:p>
+            <w:r>
+              <w:rPr>
+                <w:sz w:val="17"/>
+              </w:rPr>
+              <w:t>-2.16</w:t>
+            </w:r>
+          </w:p>
+        </w:tc>
+        <w:tc>
+          <w:tcPr>
+            <w:tcW w:type="dxa" w:w="1234"/>
+          </w:tcPr>
+          <w:p>
+            <w:r>
+              <w:rPr>
+                <w:sz w:val="17"/>
+              </w:rPr>
+              <w:t>-1.00</w:t>
+            </w:r>
+          </w:p>
+        </w:tc>
+        <w:tc>
+          <w:tcPr>
+            <w:tcW w:type="dxa" w:w="1234"/>
+          </w:tcPr>
+          <w:p>
+            <w:r>
+              <w:rPr>
+                <w:sz w:val="17"/>
+              </w:rPr>
+              <w:t>0.006 *</w:t>
+            </w:r>
+          </w:p>
+        </w:tc>
+        <w:tc>
+          <w:tcPr>
+            <w:tcW w:type="dxa" w:w="1234"/>
+          </w:tcPr>
+          <w:p>
+            <w:r>
+              <w:rPr>
+                <w:sz w:val="17"/>
+              </w:rPr>
+              <w:t>15</w:t>
+            </w:r>
+          </w:p>
+        </w:tc>
+      </w:tr>
+      <w:tr>
+        <w:tc>
+          <w:tcPr>
+            <w:tcW w:type="dxa" w:w="1234"/>
+          </w:tcPr>
+          <w:p>
+            <w:r>
+              <w:rPr>
+                <w:sz w:val="17"/>
+              </w:rPr>
+              <w:t>D2 (HIIT)</w:t>
+            </w:r>
+          </w:p>
+        </w:tc>
+        <w:tc>
+          <w:tcPr>
+            <w:tcW w:type="dxa" w:w="1234"/>
+          </w:tcPr>
+          <w:p>
+            <w:r>
+              <w:rPr>
+                <w:sz w:val="17"/>
+              </w:rPr>
+              <w:t>6.00 ± 3.46</w:t>
+            </w:r>
+          </w:p>
+        </w:tc>
+        <w:tc>
+          <w:tcPr>
+            <w:tcW w:type="dxa" w:w="1234"/>
+          </w:tcPr>
+          <w:p>
+            <w:r>
+              <w:rPr>
+                <w:sz w:val="17"/>
+              </w:rPr>
+              <w:t>4.73 ± 2.99</w:t>
+            </w:r>
+          </w:p>
+        </w:tc>
+        <w:tc>
+          <w:tcPr>
+            <w:tcW w:type="dxa" w:w="1234"/>
+          </w:tcPr>
+          <w:p>
+            <w:r>
+              <w:rPr>
+                <w:sz w:val="17"/>
+              </w:rPr>
+              <w:t>-1.27</w:t>
+            </w:r>
+          </w:p>
+        </w:tc>
+        <w:tc>
+          <w:tcPr>
+            <w:tcW w:type="dxa" w:w="1234"/>
+          </w:tcPr>
+          <w:p>
+            <w:r>
+              <w:rPr>
+                <w:sz w:val="17"/>
+              </w:rPr>
+              <w:t>-0.39</w:t>
+            </w:r>
+          </w:p>
+        </w:tc>
+        <w:tc>
+          <w:tcPr>
+            <w:tcW w:type="dxa" w:w="1234"/>
+          </w:tcPr>
+          <w:p>
+            <w:r>
+              <w:rPr>
+                <w:sz w:val="17"/>
+              </w:rPr>
+              <w:t>0.091</w:t>
+            </w:r>
+          </w:p>
+        </w:tc>
+        <w:tc>
+          <w:tcPr>
+            <w:tcW w:type="dxa" w:w="1234"/>
+          </w:tcPr>
+          <w:p>
+            <w:r>
+              <w:rPr>
+                <w:sz w:val="17"/>
+              </w:rPr>
+              <w:t>26</w:t>
+            </w:r>
+          </w:p>
+        </w:tc>
+      </w:tr>
+      <w:tr>
+        <w:tc>
+          <w:tcPr>
+            <w:tcW w:type="dxa" w:w="1234"/>
+          </w:tcPr>
+          <w:p>
+            <w:r>
+              <w:rPr>
+                <w:sz w:val="17"/>
+              </w:rPr>
+              <w:t>D3</w:t>
+            </w:r>
+          </w:p>
+        </w:tc>
+        <w:tc>
+          <w:tcPr>
+            <w:tcW w:type="dxa" w:w="1234"/>
+          </w:tcPr>
+          <w:p>
+            <w:r>
+              <w:rPr>
+                <w:sz w:val="17"/>
+              </w:rPr>
+              <w:t>5.92 ± 3.42</w:t>
+            </w:r>
+          </w:p>
+        </w:tc>
+        <w:tc>
+          <w:tcPr>
+            <w:tcW w:type="dxa" w:w="1234"/>
+          </w:tcPr>
+          <w:p>
+            <w:r>
+              <w:rPr>
+                <w:sz w:val="17"/>
+              </w:rPr>
+              <w:t>4.90 ± 3.40</w:t>
+            </w:r>
+          </w:p>
+        </w:tc>
+        <w:tc>
+          <w:tcPr>
+            <w:tcW w:type="dxa" w:w="1234"/>
+          </w:tcPr>
+          <w:p>
+            <w:r>
+              <w:rPr>
+                <w:sz w:val="17"/>
+              </w:rPr>
+              <w:t>-1.02</w:t>
+            </w:r>
+          </w:p>
+        </w:tc>
+        <w:tc>
+          <w:tcPr>
+            <w:tcW w:type="dxa" w:w="1234"/>
+          </w:tcPr>
+          <w:p>
+            <w:r>
+              <w:rPr>
+                <w:sz w:val="17"/>
+              </w:rPr>
+              <w:t>-0.22</w:t>
+            </w:r>
+          </w:p>
+        </w:tc>
+        <w:tc>
+          <w:tcPr>
+            <w:tcW w:type="dxa" w:w="1234"/>
+          </w:tcPr>
+          <w:p>
+            <w:r>
+              <w:rPr>
+                <w:sz w:val="17"/>
+              </w:rPr>
+              <w:t>0.369</w:t>
+            </w:r>
+          </w:p>
+        </w:tc>
+        <w:tc>
+          <w:tcPr>
+            <w:tcW w:type="dxa" w:w="1234"/>
+          </w:tcPr>
+          <w:p>
+            <w:r>
+              <w:rPr>
+                <w:sz w:val="17"/>
+              </w:rPr>
+              <w:t>21</w:t>
+            </w:r>
+          </w:p>
+        </w:tc>
+      </w:tr>
+      <w:tr>
+        <w:tc>
+          <w:tcPr>
+            <w:tcW w:type="dxa" w:w="1234"/>
+          </w:tcPr>
+          <w:p>
+            <w:r>
+              <w:rPr>
+                <w:sz w:val="17"/>
+              </w:rPr>
+              <w:t>D4 (HIIT)</w:t>
+            </w:r>
+          </w:p>
+        </w:tc>
+        <w:tc>
+          <w:tcPr>
+            <w:tcW w:type="dxa" w:w="1234"/>
+          </w:tcPr>
+          <w:p>
+            <w:r>
+              <w:rPr>
+                <w:sz w:val="17"/>
+              </w:rPr>
+              <w:t>5.71 ± 3.15</w:t>
+            </w:r>
+          </w:p>
+        </w:tc>
+        <w:tc>
+          <w:tcPr>
+            <w:tcW w:type="dxa" w:w="1234"/>
+          </w:tcPr>
+          <w:p>
+            <w:r>
+              <w:rPr>
+                <w:sz w:val="17"/>
+              </w:rPr>
+              <w:t>5.06 ± 3.24</w:t>
+            </w:r>
+          </w:p>
+        </w:tc>
+        <w:tc>
+          <w:tcPr>
+            <w:tcW w:type="dxa" w:w="1234"/>
+          </w:tcPr>
+          <w:p>
+            <w:r>
+              <w:rPr>
+                <w:sz w:val="17"/>
+              </w:rPr>
+              <w:t>-0.66</w:t>
+            </w:r>
+          </w:p>
+        </w:tc>
+        <w:tc>
+          <w:tcPr>
+            <w:tcW w:type="dxa" w:w="1234"/>
+          </w:tcPr>
+          <w:p>
+            <w:r>
+              <w:rPr>
+                <w:sz w:val="17"/>
+              </w:rPr>
+              <w:t>-0.26</w:t>
+            </w:r>
+          </w:p>
+        </w:tc>
+        <w:tc>
+          <w:tcPr>
+            <w:tcW w:type="dxa" w:w="1234"/>
+          </w:tcPr>
+          <w:p>
+            <w:r>
+              <w:rPr>
+                <w:sz w:val="17"/>
+              </w:rPr>
+              <w:t>0.245</w:t>
+            </w:r>
+          </w:p>
+        </w:tc>
+        <w:tc>
+          <w:tcPr>
+            <w:tcW w:type="dxa" w:w="1234"/>
+          </w:tcPr>
+          <w:p>
+            <w:r>
+              <w:rPr>
+                <w:sz w:val="17"/>
+              </w:rPr>
+              <w:t>18</w:t>
+            </w:r>
+          </w:p>
+        </w:tc>
+      </w:tr>
+      <w:tr>
+        <w:tc>
+          <w:tcPr>
+            <w:tcW w:type="dxa" w:w="1234"/>
+          </w:tcPr>
+          <w:p>
+            <w:r>
+              <w:rPr>
+                <w:sz w:val="17"/>
+              </w:rPr>
+              <w:t>D5</w:t>
+            </w:r>
+          </w:p>
+        </w:tc>
+        <w:tc>
+          <w:tcPr>
+            <w:tcW w:type="dxa" w:w="1234"/>
+          </w:tcPr>
+          <w:p>
+            <w:r>
+              <w:rPr>
+                <w:sz w:val="17"/>
+              </w:rPr>
+              <w:t>5.78 ± 2.66</w:t>
+            </w:r>
+          </w:p>
+        </w:tc>
+        <w:tc>
+          <w:tcPr>
+            <w:tcW w:type="dxa" w:w="1234"/>
+          </w:tcPr>
+          <w:p>
+            <w:r>
+              <w:rPr>
+                <w:sz w:val="17"/>
+              </w:rPr>
+              <w:t>6.11 ± 2.35</w:t>
+            </w:r>
+          </w:p>
+        </w:tc>
+        <w:tc>
+          <w:tcPr>
+            <w:tcW w:type="dxa" w:w="1234"/>
+          </w:tcPr>
+          <w:p>
+            <w:r>
+              <w:rPr>
+                <w:sz w:val="17"/>
+              </w:rPr>
+              <w:t>+0.32</w:t>
+            </w:r>
+          </w:p>
+        </w:tc>
+        <w:tc>
+          <w:tcPr>
+            <w:tcW w:type="dxa" w:w="1234"/>
+          </w:tcPr>
+          <w:p>
+            <w:r>
+              <w:rPr>
+                <w:sz w:val="17"/>
+              </w:rPr>
+              <w:t>-0.12</w:t>
+            </w:r>
+          </w:p>
+        </w:tc>
+        <w:tc>
+          <w:tcPr>
+            <w:tcW w:type="dxa" w:w="1234"/>
+          </w:tcPr>
+          <w:p>
+            <w:r>
+              <w:rPr>
+                <w:sz w:val="17"/>
+              </w:rPr>
+              <w:t>0.794</w:t>
+            </w:r>
+          </w:p>
+        </w:tc>
+        <w:tc>
+          <w:tcPr>
+            <w:tcW w:type="dxa" w:w="1234"/>
+          </w:tcPr>
+          <w:p>
+            <w:r>
+              <w:rPr>
+                <w:sz w:val="17"/>
+              </w:rPr>
+              <w:t>19</w:t>
+            </w:r>
+          </w:p>
+        </w:tc>
+      </w:tr>
+      <w:tr>
+        <w:tc>
+          <w:tcPr>
+            <w:tcW w:type="dxa" w:w="1234"/>
+          </w:tcPr>
+          <w:p>
+            <w:r>
+              <w:rPr>
+                <w:sz w:val="17"/>
+              </w:rPr>
+              <w:t>D6</w:t>
+            </w:r>
+          </w:p>
+        </w:tc>
+        <w:tc>
+          <w:tcPr>
+            <w:tcW w:type="dxa" w:w="1234"/>
+          </w:tcPr>
+          <w:p>
+            <w:r>
+              <w:rPr>
+                <w:sz w:val="17"/>
+              </w:rPr>
+              <w:t>6.55 ± 3.61</w:t>
+            </w:r>
+          </w:p>
+        </w:tc>
+        <w:tc>
+          <w:tcPr>
+            <w:tcW w:type="dxa" w:w="1234"/>
+          </w:tcPr>
+          <w:p>
+            <w:r>
+              <w:rPr>
+                <w:sz w:val="17"/>
+              </w:rPr>
+              <w:t>4.75 ± 3.73</w:t>
+            </w:r>
+          </w:p>
+        </w:tc>
+        <w:tc>
+          <w:tcPr>
+            <w:tcW w:type="dxa" w:w="1234"/>
+          </w:tcPr>
+          <w:p>
+            <w:r>
+              <w:rPr>
+                <w:sz w:val="17"/>
+              </w:rPr>
+              <w:t>-1.80</w:t>
+            </w:r>
+          </w:p>
+        </w:tc>
+        <w:tc>
+          <w:tcPr>
+            <w:tcW w:type="dxa" w:w="1234"/>
+          </w:tcPr>
+          <w:p>
+            <w:r>
+              <w:rPr>
+                <w:sz w:val="17"/>
+              </w:rPr>
+              <w:t>-0.64</w:t>
+            </w:r>
+          </w:p>
+        </w:tc>
+        <w:tc>
+          <w:tcPr>
+            <w:tcW w:type="dxa" w:w="1234"/>
+          </w:tcPr>
+          <w:p>
+            <w:r>
+              <w:rPr>
+                <w:sz w:val="17"/>
+              </w:rPr>
+              <w:t>0.009 *</w:t>
+            </w:r>
+          </w:p>
+        </w:tc>
+        <w:tc>
+          <w:tcPr>
+            <w:tcW w:type="dxa" w:w="1234"/>
+          </w:tcPr>
+          <w:p>
+            <w:r>
+              <w:rPr>
+                <w:sz w:val="17"/>
+              </w:rPr>
+              <w:t>20</w:t>
+            </w:r>
+          </w:p>
+        </w:tc>
+      </w:tr>
+      <w:tr>
+        <w:tc>
+          <w:tcPr>
+            <w:tcW w:type="dxa" w:w="1234"/>
+          </w:tcPr>
+          <w:p>
+            <w:r>
+              <w:rPr>
+                <w:sz w:val="17"/>
+              </w:rPr>
+              <w:t>D7 (HIIT)</w:t>
+            </w:r>
+          </w:p>
+        </w:tc>
+        <w:tc>
+          <w:tcPr>
+            <w:tcW w:type="dxa" w:w="1234"/>
+          </w:tcPr>
+          <w:p>
+            <w:r>
+              <w:rPr>
+                <w:sz w:val="17"/>
+              </w:rPr>
+              <w:t>4.48 ± 2.80</w:t>
+            </w:r>
+          </w:p>
+        </w:tc>
+        <w:tc>
+          <w:tcPr>
+            <w:tcW w:type="dxa" w:w="1234"/>
+          </w:tcPr>
+          <w:p>
+            <w:r>
+              <w:rPr>
+                <w:sz w:val="17"/>
+              </w:rPr>
+              <w:t>4.38 ± 2.83</w:t>
+            </w:r>
+          </w:p>
+        </w:tc>
+        <w:tc>
+          <w:tcPr>
+            <w:tcW w:type="dxa" w:w="1234"/>
+          </w:tcPr>
+          <w:p>
+            <w:r>
+              <w:rPr>
+                <w:sz w:val="17"/>
+              </w:rPr>
+              <w:t>-0.10</w:t>
+            </w:r>
+          </w:p>
+        </w:tc>
+        <w:tc>
+          <w:tcPr>
+            <w:tcW w:type="dxa" w:w="1234"/>
+          </w:tcPr>
+          <w:p>
+            <w:r>
+              <w:rPr>
+                <w:sz w:val="17"/>
+              </w:rPr>
+              <w:t>-0.20</w:t>
+            </w:r>
+          </w:p>
+        </w:tc>
+        <w:tc>
+          <w:tcPr>
+            <w:tcW w:type="dxa" w:w="1234"/>
+          </w:tcPr>
+          <w:p>
+            <w:r>
+              <w:rPr>
+                <w:sz w:val="17"/>
+              </w:rPr>
+              <w:t>0.453</w:t>
+            </w:r>
+          </w:p>
+        </w:tc>
+        <w:tc>
+          <w:tcPr>
+            <w:tcW w:type="dxa" w:w="1234"/>
+          </w:tcPr>
+          <w:p>
+            <w:r>
+              <w:rPr>
+                <w:sz w:val="17"/>
+              </w:rPr>
+              <w:t>16</w:t>
+            </w:r>
+          </w:p>
+        </w:tc>
+      </w:tr>
+    </w:tbl>
+    <w:p/>
+    <w:p>
+      <w:r>
+        <w:rPr>
+          <w:b/>
+          <w:sz w:val="19"/>
+        </w:rPr>
+        <w:t>Tabela 7 — Fadiga BRUMS (0–20): pré vs pós por dia</w:t>
+      </w:r>
+    </w:p>
+    <w:tbl>
+      <w:tblPr>
+        <w:tblStyle w:val="LightGrid-Accent1"/>
+        <w:tblW w:type="auto" w:w="0"/>
+        <w:jc w:val="center"/>
+        <w:tblLook w:firstColumn="1" w:firstRow="1" w:lastColumn="0" w:lastRow="0" w:noHBand="0" w:noVBand="1" w:val="04A0"/>
+      </w:tblPr>
+      <w:tblGrid>
+        <w:gridCol w:w="1234"/>
+        <w:gridCol w:w="1234"/>
+        <w:gridCol w:w="1234"/>
+        <w:gridCol w:w="1234"/>
+        <w:gridCol w:w="1234"/>
+        <w:gridCol w:w="1234"/>
+        <w:gridCol w:w="1234"/>
+      </w:tblGrid>
+      <w:tr>
+        <w:tc>
+          <w:tcPr>
+            <w:tcW w:type="dxa" w:w="1234"/>
+          </w:tcPr>
+          <w:p>
+            <w:r>
+              <w:rPr>
+                <w:b/>
+                <w:sz w:val="17"/>
+              </w:rPr>
+              <w:t>Dia</w:t>
+            </w:r>
+          </w:p>
+        </w:tc>
+        <w:tc>
+          <w:tcPr>
+            <w:tcW w:type="dxa" w:w="1234"/>
+          </w:tcPr>
+          <w:p>
+            <w:r>
+              <w:rPr>
+                <w:b/>
+                <w:sz w:val="17"/>
+              </w:rPr>
+              <w:t>Pré (m ± DP)</w:t>
+            </w:r>
+          </w:p>
+        </w:tc>
+        <w:tc>
+          <w:tcPr>
+            <w:tcW w:type="dxa" w:w="1234"/>
+          </w:tcPr>
+          <w:p>
+            <w:r>
+              <w:rPr>
+                <w:b/>
+                <w:sz w:val="17"/>
+              </w:rPr>
+              <w:t>Pós (m ± DP)</w:t>
+            </w:r>
+          </w:p>
+        </w:tc>
+        <w:tc>
+          <w:tcPr>
+            <w:tcW w:type="dxa" w:w="1234"/>
+          </w:tcPr>
+          <w:p>
+            <w:r>
+              <w:rPr>
+                <w:b/>
+                <w:sz w:val="17"/>
+              </w:rPr>
+              <w:t>Δ (pós−pré)</w:t>
+            </w:r>
+          </w:p>
+        </w:tc>
+        <w:tc>
+          <w:tcPr>
+            <w:tcW w:type="dxa" w:w="1234"/>
+          </w:tcPr>
+          <w:p>
+            <w:r>
+              <w:rPr>
+                <w:b/>
+                <w:sz w:val="17"/>
+              </w:rPr>
+              <w:t>dz</w:t>
+            </w:r>
+          </w:p>
+        </w:tc>
+        <w:tc>
+          <w:tcPr>
+            <w:tcW w:type="dxa" w:w="1234"/>
+          </w:tcPr>
+          <w:p>
+            <w:r>
+              <w:rPr>
+                <w:b/>
+                <w:sz w:val="17"/>
+              </w:rPr>
+              <w:t>p (Wilcoxon)</w:t>
+            </w:r>
+          </w:p>
+        </w:tc>
+        <w:tc>
+          <w:tcPr>
+            <w:tcW w:type="dxa" w:w="1234"/>
+          </w:tcPr>
+          <w:p>
+            <w:r>
+              <w:rPr>
+                <w:b/>
+                <w:sz w:val="17"/>
+              </w:rPr>
+              <w:t>n pares</w:t>
+            </w:r>
+          </w:p>
+        </w:tc>
+      </w:tr>
+      <w:tr>
+        <w:tc>
+          <w:tcPr>
+            <w:tcW w:type="dxa" w:w="1234"/>
+          </w:tcPr>
+          <w:p>
+            <w:r>
+              <w:rPr>
+                <w:sz w:val="17"/>
+              </w:rPr>
+              <w:t>D1</w:t>
+            </w:r>
+          </w:p>
+        </w:tc>
+        <w:tc>
+          <w:tcPr>
+            <w:tcW w:type="dxa" w:w="1234"/>
+          </w:tcPr>
+          <w:p>
+            <w:r>
+              <w:rPr>
+                <w:sz w:val="17"/>
+              </w:rPr>
+              <w:t>3.37 ± 2.82</w:t>
+            </w:r>
+          </w:p>
+        </w:tc>
+        <w:tc>
+          <w:tcPr>
+            <w:tcW w:type="dxa" w:w="1234"/>
+          </w:tcPr>
+          <w:p>
+            <w:r>
+              <w:rPr>
+                <w:sz w:val="17"/>
+              </w:rPr>
+              <w:t>4.40 ± 3.78</w:t>
+            </w:r>
+          </w:p>
+        </w:tc>
+        <w:tc>
+          <w:tcPr>
+            <w:tcW w:type="dxa" w:w="1234"/>
+          </w:tcPr>
+          <w:p>
+            <w:r>
+              <w:rPr>
+                <w:sz w:val="17"/>
+              </w:rPr>
+              <w:t>+1.03</w:t>
+            </w:r>
+          </w:p>
+        </w:tc>
+        <w:tc>
+          <w:tcPr>
+            <w:tcW w:type="dxa" w:w="1234"/>
+          </w:tcPr>
+          <w:p>
+            <w:r>
+              <w:rPr>
+                <w:sz w:val="17"/>
+              </w:rPr>
+              <w:t>+0.74</w:t>
+            </w:r>
+          </w:p>
+        </w:tc>
+        <w:tc>
+          <w:tcPr>
+            <w:tcW w:type="dxa" w:w="1234"/>
+          </w:tcPr>
+          <w:p>
+            <w:r>
+              <w:rPr>
+                <w:sz w:val="17"/>
+              </w:rPr>
+              <w:t>0.012 *</w:t>
+            </w:r>
+          </w:p>
+        </w:tc>
+        <w:tc>
+          <w:tcPr>
+            <w:tcW w:type="dxa" w:w="1234"/>
+          </w:tcPr>
+          <w:p>
+            <w:r>
+              <w:rPr>
+                <w:sz w:val="17"/>
+              </w:rPr>
+              <w:t>15</w:t>
+            </w:r>
+          </w:p>
+        </w:tc>
+      </w:tr>
+      <w:tr>
+        <w:tc>
+          <w:tcPr>
+            <w:tcW w:type="dxa" w:w="1234"/>
+          </w:tcPr>
+          <w:p>
+            <w:r>
+              <w:rPr>
+                <w:sz w:val="17"/>
+              </w:rPr>
+              <w:t>D2 (HIIT)</w:t>
+            </w:r>
+          </w:p>
+        </w:tc>
+        <w:tc>
+          <w:tcPr>
+            <w:tcW w:type="dxa" w:w="1234"/>
+          </w:tcPr>
+          <w:p>
+            <w:r>
+              <w:rPr>
+                <w:sz w:val="17"/>
+              </w:rPr>
+              <w:t>3.96 ± 3.18</w:t>
+            </w:r>
+          </w:p>
+        </w:tc>
+        <w:tc>
+          <w:tcPr>
+            <w:tcW w:type="dxa" w:w="1234"/>
+          </w:tcPr>
+          <w:p>
+            <w:r>
+              <w:rPr>
+                <w:sz w:val="17"/>
+              </w:rPr>
+              <w:t>6.54 ± 3.95</w:t>
+            </w:r>
+          </w:p>
+        </w:tc>
+        <w:tc>
+          <w:tcPr>
+            <w:tcW w:type="dxa" w:w="1234"/>
+          </w:tcPr>
+          <w:p>
+            <w:r>
+              <w:rPr>
+                <w:sz w:val="17"/>
+              </w:rPr>
+              <w:t>+2.58</w:t>
+            </w:r>
+          </w:p>
+        </w:tc>
+        <w:tc>
+          <w:tcPr>
+            <w:tcW w:type="dxa" w:w="1234"/>
+          </w:tcPr>
+          <w:p>
+            <w:r>
+              <w:rPr>
+                <w:sz w:val="17"/>
+              </w:rPr>
+              <w:t>+0.64</w:t>
+            </w:r>
+          </w:p>
+        </w:tc>
+        <w:tc>
+          <w:tcPr>
+            <w:tcW w:type="dxa" w:w="1234"/>
+          </w:tcPr>
+          <w:p>
+            <w:r>
+              <w:rPr>
+                <w:sz w:val="17"/>
+              </w:rPr>
+              <w:t>0.008 *</w:t>
+            </w:r>
+          </w:p>
+        </w:tc>
+        <w:tc>
+          <w:tcPr>
+            <w:tcW w:type="dxa" w:w="1234"/>
+          </w:tcPr>
+          <w:p>
+            <w:r>
+              <w:rPr>
+                <w:sz w:val="17"/>
+              </w:rPr>
+              <w:t>26</w:t>
+            </w:r>
+          </w:p>
+        </w:tc>
+      </w:tr>
+      <w:tr>
+        <w:tc>
+          <w:tcPr>
+            <w:tcW w:type="dxa" w:w="1234"/>
+          </w:tcPr>
+          <w:p>
+            <w:r>
+              <w:rPr>
+                <w:sz w:val="17"/>
+              </w:rPr>
+              <w:t>D3</w:t>
+            </w:r>
+          </w:p>
+        </w:tc>
+        <w:tc>
+          <w:tcPr>
+            <w:tcW w:type="dxa" w:w="1234"/>
+          </w:tcPr>
+          <w:p>
+            <w:r>
+              <w:rPr>
+                <w:sz w:val="17"/>
+              </w:rPr>
+              <w:t>4.42 ± 3.18</w:t>
+            </w:r>
+          </w:p>
+        </w:tc>
+        <w:tc>
+          <w:tcPr>
+            <w:tcW w:type="dxa" w:w="1234"/>
+          </w:tcPr>
+          <w:p>
+            <w:r>
+              <w:rPr>
+                <w:sz w:val="17"/>
+              </w:rPr>
+              <w:t>5.90 ± 3.82</w:t>
+            </w:r>
+          </w:p>
+        </w:tc>
+        <w:tc>
+          <w:tcPr>
+            <w:tcW w:type="dxa" w:w="1234"/>
+          </w:tcPr>
+          <w:p>
+            <w:r>
+              <w:rPr>
+                <w:sz w:val="17"/>
+              </w:rPr>
+              <w:t>+1.48</w:t>
+            </w:r>
+          </w:p>
+        </w:tc>
+        <w:tc>
+          <w:tcPr>
+            <w:tcW w:type="dxa" w:w="1234"/>
+          </w:tcPr>
+          <w:p>
+            <w:r>
+              <w:rPr>
+                <w:sz w:val="17"/>
+              </w:rPr>
+              <w:t>+0.28</w:t>
+            </w:r>
+          </w:p>
+        </w:tc>
+        <w:tc>
+          <w:tcPr>
+            <w:tcW w:type="dxa" w:w="1234"/>
+          </w:tcPr>
+          <w:p>
+            <w:r>
+              <w:rPr>
+                <w:sz w:val="17"/>
+              </w:rPr>
+              <w:t>0.259</w:t>
+            </w:r>
+          </w:p>
+        </w:tc>
+        <w:tc>
+          <w:tcPr>
+            <w:tcW w:type="dxa" w:w="1234"/>
+          </w:tcPr>
+          <w:p>
+            <w:r>
+              <w:rPr>
+                <w:sz w:val="17"/>
+              </w:rPr>
+              <w:t>21</w:t>
+            </w:r>
+          </w:p>
+        </w:tc>
+      </w:tr>
+      <w:tr>
+        <w:tc>
+          <w:tcPr>
+            <w:tcW w:type="dxa" w:w="1234"/>
+          </w:tcPr>
+          <w:p>
+            <w:r>
+              <w:rPr>
+                <w:sz w:val="17"/>
+              </w:rPr>
+              <w:t>D4 (HIIT)</w:t>
+            </w:r>
+          </w:p>
+        </w:tc>
+        <w:tc>
+          <w:tcPr>
+            <w:tcW w:type="dxa" w:w="1234"/>
+          </w:tcPr>
+          <w:p>
+            <w:r>
+              <w:rPr>
+                <w:sz w:val="17"/>
+              </w:rPr>
+              <w:t>5.33 ± 4.31</w:t>
+            </w:r>
+          </w:p>
+        </w:tc>
+        <w:tc>
+          <w:tcPr>
+            <w:tcW w:type="dxa" w:w="1234"/>
+          </w:tcPr>
+          <w:p>
+            <w:r>
+              <w:rPr>
+                <w:sz w:val="17"/>
+              </w:rPr>
+              <w:t>6.28 ± 4.24</w:t>
+            </w:r>
+          </w:p>
+        </w:tc>
+        <w:tc>
+          <w:tcPr>
+            <w:tcW w:type="dxa" w:w="1234"/>
+          </w:tcPr>
+          <w:p>
+            <w:r>
+              <w:rPr>
+                <w:sz w:val="17"/>
+              </w:rPr>
+              <w:t>+0.94</w:t>
+            </w:r>
+          </w:p>
+        </w:tc>
+        <w:tc>
+          <w:tcPr>
+            <w:tcW w:type="dxa" w:w="1234"/>
+          </w:tcPr>
+          <w:p>
+            <w:r>
+              <w:rPr>
+                <w:sz w:val="17"/>
+              </w:rPr>
+              <w:t>+0.23</w:t>
+            </w:r>
+          </w:p>
+        </w:tc>
+        <w:tc>
+          <w:tcPr>
+            <w:tcW w:type="dxa" w:w="1234"/>
+          </w:tcPr>
+          <w:p>
+            <w:r>
+              <w:rPr>
+                <w:sz w:val="17"/>
+              </w:rPr>
+              <w:t>0.362</w:t>
+            </w:r>
+          </w:p>
+        </w:tc>
+        <w:tc>
+          <w:tcPr>
+            <w:tcW w:type="dxa" w:w="1234"/>
+          </w:tcPr>
+          <w:p>
+            <w:r>
+              <w:rPr>
+                <w:sz w:val="17"/>
+              </w:rPr>
+              <w:t>18</w:t>
+            </w:r>
+          </w:p>
+        </w:tc>
+      </w:tr>
+      <w:tr>
+        <w:tc>
+          <w:tcPr>
+            <w:tcW w:type="dxa" w:w="1234"/>
+          </w:tcPr>
+          <w:p>
+            <w:r>
+              <w:rPr>
+                <w:sz w:val="17"/>
+              </w:rPr>
+              <w:t>D5</w:t>
+            </w:r>
+          </w:p>
+        </w:tc>
+        <w:tc>
+          <w:tcPr>
+            <w:tcW w:type="dxa" w:w="1234"/>
+          </w:tcPr>
+          <w:p>
+            <w:r>
+              <w:rPr>
+                <w:sz w:val="17"/>
+              </w:rPr>
+              <w:t>4.83 ± 4.10</w:t>
+            </w:r>
+          </w:p>
+        </w:tc>
+        <w:tc>
+          <w:tcPr>
+            <w:tcW w:type="dxa" w:w="1234"/>
+          </w:tcPr>
+          <w:p>
+            <w:r>
+              <w:rPr>
+                <w:sz w:val="17"/>
+              </w:rPr>
+              <w:t>5.53 ± 4.03</w:t>
+            </w:r>
+          </w:p>
+        </w:tc>
+        <w:tc>
+          <w:tcPr>
+            <w:tcW w:type="dxa" w:w="1234"/>
+          </w:tcPr>
+          <w:p>
+            <w:r>
+              <w:rPr>
+                <w:sz w:val="17"/>
+              </w:rPr>
+              <w:t>+0.70</w:t>
+            </w:r>
+          </w:p>
+        </w:tc>
+        <w:tc>
+          <w:tcPr>
+            <w:tcW w:type="dxa" w:w="1234"/>
+          </w:tcPr>
+          <w:p>
+            <w:r>
+              <w:rPr>
+                <w:sz w:val="17"/>
+              </w:rPr>
+              <w:t>+0.38</w:t>
+            </w:r>
+          </w:p>
+        </w:tc>
+        <w:tc>
+          <w:tcPr>
+            <w:tcW w:type="dxa" w:w="1234"/>
+          </w:tcPr>
+          <w:p>
+            <w:r>
+              <w:rPr>
+                <w:sz w:val="17"/>
+              </w:rPr>
+              <w:t>0.121</w:t>
+            </w:r>
+          </w:p>
+        </w:tc>
+        <w:tc>
+          <w:tcPr>
+            <w:tcW w:type="dxa" w:w="1234"/>
+          </w:tcPr>
+          <w:p>
+            <w:r>
+              <w:rPr>
+                <w:sz w:val="17"/>
+              </w:rPr>
+              <w:t>19</w:t>
+            </w:r>
+          </w:p>
+        </w:tc>
+      </w:tr>
+      <w:tr>
+        <w:tc>
+          <w:tcPr>
+            <w:tcW w:type="dxa" w:w="1234"/>
+          </w:tcPr>
+          <w:p>
+            <w:r>
+              <w:rPr>
+                <w:sz w:val="17"/>
+              </w:rPr>
+              <w:t>D6</w:t>
+            </w:r>
+          </w:p>
+        </w:tc>
+        <w:tc>
+          <w:tcPr>
+            <w:tcW w:type="dxa" w:w="1234"/>
+          </w:tcPr>
+          <w:p>
+            <w:r>
+              <w:rPr>
+                <w:sz w:val="17"/>
+              </w:rPr>
+              <w:t>5.32 ± 4.34</w:t>
+            </w:r>
+          </w:p>
+        </w:tc>
+        <w:tc>
+          <w:tcPr>
+            <w:tcW w:type="dxa" w:w="1234"/>
+          </w:tcPr>
+          <w:p>
+            <w:r>
+              <w:rPr>
+                <w:sz w:val="17"/>
+              </w:rPr>
+              <w:t>6.70 ± 4.19</w:t>
+            </w:r>
+          </w:p>
+        </w:tc>
+        <w:tc>
+          <w:tcPr>
+            <w:tcW w:type="dxa" w:w="1234"/>
+          </w:tcPr>
+          <w:p>
+            <w:r>
+              <w:rPr>
+                <w:sz w:val="17"/>
+              </w:rPr>
+              <w:t>+1.38</w:t>
+            </w:r>
+          </w:p>
+        </w:tc>
+        <w:tc>
+          <w:tcPr>
+            <w:tcW w:type="dxa" w:w="1234"/>
+          </w:tcPr>
+          <w:p>
+            <w:r>
+              <w:rPr>
+                <w:sz w:val="17"/>
+              </w:rPr>
+              <w:t>+0.36</w:t>
+            </w:r>
+          </w:p>
+        </w:tc>
+        <w:tc>
+          <w:tcPr>
+            <w:tcW w:type="dxa" w:w="1234"/>
+          </w:tcPr>
+          <w:p>
+            <w:r>
+              <w:rPr>
+                <w:sz w:val="17"/>
+              </w:rPr>
+              <w:t>0.171</w:t>
+            </w:r>
+          </w:p>
+        </w:tc>
+        <w:tc>
+          <w:tcPr>
+            <w:tcW w:type="dxa" w:w="1234"/>
+          </w:tcPr>
+          <w:p>
+            <w:r>
+              <w:rPr>
+                <w:sz w:val="17"/>
+              </w:rPr>
+              <w:t>20</w:t>
+            </w:r>
+          </w:p>
+        </w:tc>
+      </w:tr>
+      <w:tr>
+        <w:tc>
+          <w:tcPr>
+            <w:tcW w:type="dxa" w:w="1234"/>
+          </w:tcPr>
+          <w:p>
+            <w:r>
+              <w:rPr>
+                <w:sz w:val="17"/>
+              </w:rPr>
+              <w:t>D7 (HIIT)</w:t>
+            </w:r>
+          </w:p>
+        </w:tc>
+        <w:tc>
+          <w:tcPr>
+            <w:tcW w:type="dxa" w:w="1234"/>
+          </w:tcPr>
+          <w:p>
+            <w:r>
+              <w:rPr>
+                <w:sz w:val="17"/>
+              </w:rPr>
+              <w:t>6.76 ± 5.04</w:t>
+            </w:r>
+          </w:p>
+        </w:tc>
+        <w:tc>
+          <w:tcPr>
+            <w:tcW w:type="dxa" w:w="1234"/>
+          </w:tcPr>
+          <w:p>
+            <w:r>
+              <w:rPr>
+                <w:sz w:val="17"/>
+              </w:rPr>
+              <w:t>7.81 ± 4.40</w:t>
+            </w:r>
+          </w:p>
+        </w:tc>
+        <w:tc>
+          <w:tcPr>
+            <w:tcW w:type="dxa" w:w="1234"/>
+          </w:tcPr>
+          <w:p>
+            <w:r>
+              <w:rPr>
+                <w:sz w:val="17"/>
+              </w:rPr>
+              <w:t>+1.05</w:t>
+            </w:r>
+          </w:p>
+        </w:tc>
+        <w:tc>
+          <w:tcPr>
+            <w:tcW w:type="dxa" w:w="1234"/>
+          </w:tcPr>
+          <w:p>
+            <w:r>
+              <w:rPr>
+                <w:sz w:val="17"/>
+              </w:rPr>
+              <w:t>+0.48</w:t>
+            </w:r>
+          </w:p>
+        </w:tc>
+        <w:tc>
+          <w:tcPr>
+            <w:tcW w:type="dxa" w:w="1234"/>
+          </w:tcPr>
+          <w:p>
+            <w:r>
+              <w:rPr>
+                <w:sz w:val="17"/>
+              </w:rPr>
+              <w:t>0.072</w:t>
+            </w:r>
+          </w:p>
+        </w:tc>
+        <w:tc>
+          <w:tcPr>
+            <w:tcW w:type="dxa" w:w="1234"/>
+          </w:tcPr>
+          <w:p>
+            <w:r>
+              <w:rPr>
+                <w:sz w:val="17"/>
+              </w:rPr>
+              <w:t>16</w:t>
+            </w:r>
+          </w:p>
+        </w:tc>
+      </w:tr>
+    </w:tbl>
+    <w:p/>
+    <w:p>
+      <w:r>
+        <w:rPr>
+          <w:b/>
+          <w:sz w:val="19"/>
+        </w:rPr>
+        <w:t>Tabela 8 — PTH/TMD: pré vs pós por dia</w:t>
+      </w:r>
+    </w:p>
+    <w:tbl>
+      <w:tblPr>
+        <w:tblStyle w:val="LightGrid-Accent1"/>
+        <w:tblW w:type="auto" w:w="0"/>
+        <w:jc w:val="center"/>
+        <w:tblLook w:firstColumn="1" w:firstRow="1" w:lastColumn="0" w:lastRow="0" w:noHBand="0" w:noVBand="1" w:val="04A0"/>
+      </w:tblPr>
+      <w:tblGrid>
+        <w:gridCol w:w="1234"/>
+        <w:gridCol w:w="1234"/>
+        <w:gridCol w:w="1234"/>
+        <w:gridCol w:w="1234"/>
+        <w:gridCol w:w="1234"/>
+        <w:gridCol w:w="1234"/>
+        <w:gridCol w:w="1234"/>
+      </w:tblGrid>
+      <w:tr>
+        <w:tc>
+          <w:tcPr>
+            <w:tcW w:type="dxa" w:w="1234"/>
+          </w:tcPr>
+          <w:p>
+            <w:r>
+              <w:rPr>
+                <w:b/>
+                <w:sz w:val="17"/>
+              </w:rPr>
+              <w:t>Dia</w:t>
+            </w:r>
+          </w:p>
+        </w:tc>
+        <w:tc>
+          <w:tcPr>
+            <w:tcW w:type="dxa" w:w="1234"/>
+          </w:tcPr>
+          <w:p>
+            <w:r>
+              <w:rPr>
+                <w:b/>
+                <w:sz w:val="17"/>
+              </w:rPr>
+              <w:t>Pré (m ± DP)</w:t>
+            </w:r>
+          </w:p>
+        </w:tc>
+        <w:tc>
+          <w:tcPr>
+            <w:tcW w:type="dxa" w:w="1234"/>
+          </w:tcPr>
+          <w:p>
+            <w:r>
+              <w:rPr>
+                <w:b/>
+                <w:sz w:val="17"/>
+              </w:rPr>
+              <w:t>Pós (m ± DP)</w:t>
+            </w:r>
+          </w:p>
+        </w:tc>
+        <w:tc>
+          <w:tcPr>
+            <w:tcW w:type="dxa" w:w="1234"/>
+          </w:tcPr>
+          <w:p>
+            <w:r>
+              <w:rPr>
+                <w:b/>
+                <w:sz w:val="17"/>
+              </w:rPr>
+              <w:t>Δ (pós−pré)</w:t>
+            </w:r>
+          </w:p>
+        </w:tc>
+        <w:tc>
+          <w:tcPr>
+            <w:tcW w:type="dxa" w:w="1234"/>
+          </w:tcPr>
+          <w:p>
+            <w:r>
+              <w:rPr>
+                <w:b/>
+                <w:sz w:val="17"/>
+              </w:rPr>
+              <w:t>dz</w:t>
+            </w:r>
+          </w:p>
+        </w:tc>
+        <w:tc>
+          <w:tcPr>
+            <w:tcW w:type="dxa" w:w="1234"/>
+          </w:tcPr>
+          <w:p>
+            <w:r>
+              <w:rPr>
+                <w:b/>
+                <w:sz w:val="17"/>
+              </w:rPr>
+              <w:t>p (Wilcoxon)</w:t>
+            </w:r>
+          </w:p>
+        </w:tc>
+        <w:tc>
+          <w:tcPr>
+            <w:tcW w:type="dxa" w:w="1234"/>
+          </w:tcPr>
+          <w:p>
+            <w:r>
+              <w:rPr>
+                <w:b/>
+                <w:sz w:val="17"/>
+              </w:rPr>
+              <w:t>n pares</w:t>
+            </w:r>
+          </w:p>
+        </w:tc>
+      </w:tr>
+      <w:tr>
+        <w:tc>
+          <w:tcPr>
+            <w:tcW w:type="dxa" w:w="1234"/>
+          </w:tcPr>
+          <w:p>
+            <w:r>
+              <w:rPr>
+                <w:sz w:val="17"/>
+              </w:rPr>
+              <w:t>D1</w:t>
+            </w:r>
+          </w:p>
+        </w:tc>
+        <w:tc>
+          <w:tcPr>
+            <w:tcW w:type="dxa" w:w="1234"/>
+          </w:tcPr>
+          <w:p>
+            <w:r>
+              <w:rPr>
+                <w:sz w:val="17"/>
+              </w:rPr>
+              <w:t>0.59 ± 7.97</w:t>
+            </w:r>
+          </w:p>
+        </w:tc>
+        <w:tc>
+          <w:tcPr>
+            <w:tcW w:type="dxa" w:w="1234"/>
+          </w:tcPr>
+          <w:p>
+            <w:r>
+              <w:rPr>
+                <w:sz w:val="17"/>
+              </w:rPr>
+              <w:t>4.67 ± 10.75</w:t>
+            </w:r>
+          </w:p>
+        </w:tc>
+        <w:tc>
+          <w:tcPr>
+            <w:tcW w:type="dxa" w:w="1234"/>
+          </w:tcPr>
+          <w:p>
+            <w:r>
+              <w:rPr>
+                <w:sz w:val="17"/>
+              </w:rPr>
+              <w:t>+4.07</w:t>
+            </w:r>
+          </w:p>
+        </w:tc>
+        <w:tc>
+          <w:tcPr>
+            <w:tcW w:type="dxa" w:w="1234"/>
+          </w:tcPr>
+          <w:p>
+            <w:r>
+              <w:rPr>
+                <w:sz w:val="17"/>
+              </w:rPr>
+              <w:t>+0.84</w:t>
+            </w:r>
+          </w:p>
+        </w:tc>
+        <w:tc>
+          <w:tcPr>
+            <w:tcW w:type="dxa" w:w="1234"/>
+          </w:tcPr>
+          <w:p>
+            <w:r>
+              <w:rPr>
+                <w:sz w:val="17"/>
+              </w:rPr>
+              <w:t>0.003 *</w:t>
+            </w:r>
+          </w:p>
+        </w:tc>
+        <w:tc>
+          <w:tcPr>
+            <w:tcW w:type="dxa" w:w="1234"/>
+          </w:tcPr>
+          <w:p>
+            <w:r>
+              <w:rPr>
+                <w:sz w:val="17"/>
+              </w:rPr>
+              <w:t>15</w:t>
+            </w:r>
+          </w:p>
+        </w:tc>
+      </w:tr>
+      <w:tr>
+        <w:tc>
+          <w:tcPr>
+            <w:tcW w:type="dxa" w:w="1234"/>
+          </w:tcPr>
+          <w:p>
+            <w:r>
+              <w:rPr>
+                <w:sz w:val="17"/>
+              </w:rPr>
+              <w:t>D2 (HIIT)</w:t>
+            </w:r>
+          </w:p>
+        </w:tc>
+        <w:tc>
+          <w:tcPr>
+            <w:tcW w:type="dxa" w:w="1234"/>
+          </w:tcPr>
+          <w:p>
+            <w:r>
+              <w:rPr>
+                <w:sz w:val="17"/>
+              </w:rPr>
+              <w:t>3.88 ± 9.62</w:t>
+            </w:r>
+          </w:p>
+        </w:tc>
+        <w:tc>
+          <w:tcPr>
+            <w:tcW w:type="dxa" w:w="1234"/>
+          </w:tcPr>
+          <w:p>
+            <w:r>
+              <w:rPr>
+                <w:sz w:val="17"/>
+              </w:rPr>
+              <w:t>6.69 ± 8.12</w:t>
+            </w:r>
+          </w:p>
+        </w:tc>
+        <w:tc>
+          <w:tcPr>
+            <w:tcW w:type="dxa" w:w="1234"/>
+          </w:tcPr>
+          <w:p>
+            <w:r>
+              <w:rPr>
+                <w:sz w:val="17"/>
+              </w:rPr>
+              <w:t>+2.81</w:t>
+            </w:r>
+          </w:p>
+        </w:tc>
+        <w:tc>
+          <w:tcPr>
+            <w:tcW w:type="dxa" w:w="1234"/>
+          </w:tcPr>
+          <w:p>
+            <w:r>
+              <w:rPr>
+                <w:sz w:val="17"/>
+              </w:rPr>
+              <w:t>+0.31</w:t>
+            </w:r>
+          </w:p>
+        </w:tc>
+        <w:tc>
+          <w:tcPr>
+            <w:tcW w:type="dxa" w:w="1234"/>
+          </w:tcPr>
+          <w:p>
+            <w:r>
+              <w:rPr>
+                <w:sz w:val="17"/>
+              </w:rPr>
+              <w:t>0.128</w:t>
+            </w:r>
+          </w:p>
+        </w:tc>
+        <w:tc>
+          <w:tcPr>
+            <w:tcW w:type="dxa" w:w="1234"/>
+          </w:tcPr>
+          <w:p>
+            <w:r>
+              <w:rPr>
+                <w:sz w:val="17"/>
+              </w:rPr>
+              <w:t>26</w:t>
+            </w:r>
+          </w:p>
+        </w:tc>
+      </w:tr>
+      <w:tr>
+        <w:tc>
+          <w:tcPr>
+            <w:tcW w:type="dxa" w:w="1234"/>
+          </w:tcPr>
+          <w:p>
+            <w:r>
+              <w:rPr>
+                <w:sz w:val="17"/>
+              </w:rPr>
+              <w:t>D3</w:t>
+            </w:r>
+          </w:p>
+        </w:tc>
+        <w:tc>
+          <w:tcPr>
+            <w:tcW w:type="dxa" w:w="1234"/>
+          </w:tcPr>
+          <w:p>
+            <w:r>
+              <w:rPr>
+                <w:sz w:val="17"/>
+              </w:rPr>
+              <w:t>2.00 ± 8.43</w:t>
+            </w:r>
+          </w:p>
+        </w:tc>
+        <w:tc>
+          <w:tcPr>
+            <w:tcW w:type="dxa" w:w="1234"/>
+          </w:tcPr>
+          <w:p>
+            <w:r>
+              <w:rPr>
+                <w:sz w:val="17"/>
+              </w:rPr>
+              <w:t>4.81 ± 9.39</w:t>
+            </w:r>
+          </w:p>
+        </w:tc>
+        <w:tc>
+          <w:tcPr>
+            <w:tcW w:type="dxa" w:w="1234"/>
+          </w:tcPr>
+          <w:p>
+            <w:r>
+              <w:rPr>
+                <w:sz w:val="17"/>
+              </w:rPr>
+              <w:t>+2.81</w:t>
+            </w:r>
+          </w:p>
+        </w:tc>
+        <w:tc>
+          <w:tcPr>
+            <w:tcW w:type="dxa" w:w="1234"/>
+          </w:tcPr>
+          <w:p>
+            <w:r>
+              <w:rPr>
+                <w:sz w:val="17"/>
+              </w:rPr>
+              <w:t>+0.16</w:t>
+            </w:r>
+          </w:p>
+        </w:tc>
+        <w:tc>
+          <w:tcPr>
+            <w:tcW w:type="dxa" w:w="1234"/>
+          </w:tcPr>
+          <w:p>
+            <w:r>
+              <w:rPr>
+                <w:sz w:val="17"/>
+              </w:rPr>
+              <w:t>0.794</w:t>
+            </w:r>
+          </w:p>
+        </w:tc>
+        <w:tc>
+          <w:tcPr>
+            <w:tcW w:type="dxa" w:w="1234"/>
+          </w:tcPr>
+          <w:p>
+            <w:r>
+              <w:rPr>
+                <w:sz w:val="17"/>
+              </w:rPr>
+              <w:t>21</w:t>
+            </w:r>
+          </w:p>
+        </w:tc>
+      </w:tr>
+      <w:tr>
+        <w:tc>
+          <w:tcPr>
+            <w:tcW w:type="dxa" w:w="1234"/>
+          </w:tcPr>
+          <w:p>
+            <w:r>
+              <w:rPr>
+                <w:sz w:val="17"/>
+              </w:rPr>
+              <w:t>D4 (HIIT)</w:t>
+            </w:r>
+          </w:p>
+        </w:tc>
+        <w:tc>
+          <w:tcPr>
+            <w:tcW w:type="dxa" w:w="1234"/>
+          </w:tcPr>
+          <w:p>
+            <w:r>
+              <w:rPr>
+                <w:sz w:val="17"/>
+              </w:rPr>
+              <w:t>3.10 ± 9.78</w:t>
+            </w:r>
+          </w:p>
+        </w:tc>
+        <w:tc>
+          <w:tcPr>
+            <w:tcW w:type="dxa" w:w="1234"/>
+          </w:tcPr>
+          <w:p>
+            <w:r>
+              <w:rPr>
+                <w:sz w:val="17"/>
+              </w:rPr>
+              <w:t>7.17 ± 11.50</w:t>
+            </w:r>
+          </w:p>
+        </w:tc>
+        <w:tc>
+          <w:tcPr>
+            <w:tcW w:type="dxa" w:w="1234"/>
+          </w:tcPr>
+          <w:p>
+            <w:r>
+              <w:rPr>
+                <w:sz w:val="17"/>
+              </w:rPr>
+              <w:t>+4.07</w:t>
+            </w:r>
+          </w:p>
+        </w:tc>
+        <w:tc>
+          <w:tcPr>
+            <w:tcW w:type="dxa" w:w="1234"/>
+          </w:tcPr>
+          <w:p>
+            <w:r>
+              <w:rPr>
+                <w:sz w:val="17"/>
+              </w:rPr>
+              <w:t>+0.50</w:t>
+            </w:r>
+          </w:p>
+        </w:tc>
+        <w:tc>
+          <w:tcPr>
+            <w:tcW w:type="dxa" w:w="1234"/>
+          </w:tcPr>
+          <w:p>
+            <w:r>
+              <w:rPr>
+                <w:sz w:val="17"/>
+              </w:rPr>
+              <w:t>0.089</w:t>
+            </w:r>
+          </w:p>
+        </w:tc>
+        <w:tc>
+          <w:tcPr>
+            <w:tcW w:type="dxa" w:w="1234"/>
+          </w:tcPr>
+          <w:p>
+            <w:r>
+              <w:rPr>
+                <w:sz w:val="17"/>
+              </w:rPr>
+              <w:t>18</w:t>
+            </w:r>
+          </w:p>
+        </w:tc>
+      </w:tr>
+      <w:tr>
+        <w:tc>
+          <w:tcPr>
+            <w:tcW w:type="dxa" w:w="1234"/>
+          </w:tcPr>
+          <w:p>
+            <w:r>
+              <w:rPr>
+                <w:sz w:val="17"/>
+              </w:rPr>
+              <w:t>D5</w:t>
+            </w:r>
+          </w:p>
+        </w:tc>
+        <w:tc>
+          <w:tcPr>
+            <w:tcW w:type="dxa" w:w="1234"/>
+          </w:tcPr>
+          <w:p>
+            <w:r>
+              <w:rPr>
+                <w:sz w:val="17"/>
+              </w:rPr>
+              <w:t>1.78 ± 8.52</w:t>
+            </w:r>
+          </w:p>
+        </w:tc>
+        <w:tc>
+          <w:tcPr>
+            <w:tcW w:type="dxa" w:w="1234"/>
+          </w:tcPr>
+          <w:p>
+            <w:r>
+              <w:rPr>
+                <w:sz w:val="17"/>
+              </w:rPr>
+              <w:t>1.95 ± 7.37</w:t>
+            </w:r>
+          </w:p>
+        </w:tc>
+        <w:tc>
+          <w:tcPr>
+            <w:tcW w:type="dxa" w:w="1234"/>
+          </w:tcPr>
+          <w:p>
+            <w:r>
+              <w:rPr>
+                <w:sz w:val="17"/>
+              </w:rPr>
+              <w:t>+0.16</w:t>
+            </w:r>
+          </w:p>
+        </w:tc>
+        <w:tc>
+          <w:tcPr>
+            <w:tcW w:type="dxa" w:w="1234"/>
+          </w:tcPr>
+          <w:p>
+            <w:r>
+              <w:rPr>
+                <w:sz w:val="17"/>
+              </w:rPr>
+              <w:t>+0.17</w:t>
+            </w:r>
+          </w:p>
+        </w:tc>
+        <w:tc>
+          <w:tcPr>
+            <w:tcW w:type="dxa" w:w="1234"/>
+          </w:tcPr>
+          <w:p>
+            <w:r>
+              <w:rPr>
+                <w:sz w:val="17"/>
+              </w:rPr>
+              <w:t>0.319</w:t>
+            </w:r>
+          </w:p>
+        </w:tc>
+        <w:tc>
+          <w:tcPr>
+            <w:tcW w:type="dxa" w:w="1234"/>
+          </w:tcPr>
+          <w:p>
+            <w:r>
+              <w:rPr>
+                <w:sz w:val="17"/>
+              </w:rPr>
+              <w:t>19</w:t>
+            </w:r>
+          </w:p>
+        </w:tc>
+      </w:tr>
+      <w:tr>
+        <w:tc>
+          <w:tcPr>
+            <w:tcW w:type="dxa" w:w="1234"/>
+          </w:tcPr>
+          <w:p>
+            <w:r>
+              <w:rPr>
+                <w:sz w:val="17"/>
+              </w:rPr>
+              <w:t>D6</w:t>
+            </w:r>
+          </w:p>
+        </w:tc>
+        <w:tc>
+          <w:tcPr>
+            <w:tcW w:type="dxa" w:w="1234"/>
+          </w:tcPr>
+          <w:p>
+            <w:r>
+              <w:rPr>
+                <w:sz w:val="17"/>
+              </w:rPr>
+              <w:t>2.36 ± 8.92</w:t>
+            </w:r>
+          </w:p>
+        </w:tc>
+        <w:tc>
+          <w:tcPr>
+            <w:tcW w:type="dxa" w:w="1234"/>
+          </w:tcPr>
+          <w:p>
+            <w:r>
+              <w:rPr>
+                <w:sz w:val="17"/>
+              </w:rPr>
+              <w:t>8.85 ± 11.81</w:t>
+            </w:r>
+          </w:p>
+        </w:tc>
+        <w:tc>
+          <w:tcPr>
+            <w:tcW w:type="dxa" w:w="1234"/>
+          </w:tcPr>
+          <w:p>
+            <w:r>
+              <w:rPr>
+                <w:sz w:val="17"/>
+              </w:rPr>
+              <w:t>+6.49</w:t>
+            </w:r>
+          </w:p>
+        </w:tc>
+        <w:tc>
+          <w:tcPr>
+            <w:tcW w:type="dxa" w:w="1234"/>
+          </w:tcPr>
+          <w:p>
+            <w:r>
+              <w:rPr>
+                <w:sz w:val="17"/>
+              </w:rPr>
+              <w:t>+0.75</w:t>
+            </w:r>
+          </w:p>
+        </w:tc>
+        <w:tc>
+          <w:tcPr>
+            <w:tcW w:type="dxa" w:w="1234"/>
+          </w:tcPr>
+          <w:p>
+            <w:r>
+              <w:rPr>
+                <w:sz w:val="17"/>
+              </w:rPr>
+              <w:t>0.007 *</w:t>
+            </w:r>
+          </w:p>
+        </w:tc>
+        <w:tc>
+          <w:tcPr>
+            <w:tcW w:type="dxa" w:w="1234"/>
+          </w:tcPr>
+          <w:p>
+            <w:r>
+              <w:rPr>
+                <w:sz w:val="17"/>
+              </w:rPr>
+              <w:t>20</w:t>
+            </w:r>
+          </w:p>
+        </w:tc>
+      </w:tr>
+      <w:tr>
+        <w:tc>
+          <w:tcPr>
+            <w:tcW w:type="dxa" w:w="1234"/>
+          </w:tcPr>
+          <w:p>
+            <w:r>
+              <w:rPr>
+                <w:sz w:val="17"/>
+              </w:rPr>
+              <w:t>D7 (HIIT)</w:t>
+            </w:r>
+          </w:p>
+        </w:tc>
+        <w:tc>
+          <w:tcPr>
+            <w:tcW w:type="dxa" w:w="1234"/>
+          </w:tcPr>
+          <w:p>
+            <w:r>
+              <w:rPr>
+                <w:sz w:val="17"/>
+              </w:rPr>
+              <w:t>7.19 ± 13.06</w:t>
+            </w:r>
+          </w:p>
+        </w:tc>
+        <w:tc>
+          <w:tcPr>
+            <w:tcW w:type="dxa" w:w="1234"/>
+          </w:tcPr>
+          <w:p>
+            <w:r>
+              <w:rPr>
+                <w:sz w:val="17"/>
+              </w:rPr>
+              <w:t>9.75 ± 14.00</w:t>
+            </w:r>
+          </w:p>
+        </w:tc>
+        <w:tc>
+          <w:tcPr>
+            <w:tcW w:type="dxa" w:w="1234"/>
+          </w:tcPr>
+          <w:p>
+            <w:r>
+              <w:rPr>
+                <w:sz w:val="17"/>
+              </w:rPr>
+              <w:t>+2.56</w:t>
+            </w:r>
+          </w:p>
+        </w:tc>
+        <w:tc>
+          <w:tcPr>
+            <w:tcW w:type="dxa" w:w="1234"/>
+          </w:tcPr>
+          <w:p>
+            <w:r>
+              <w:rPr>
+                <w:sz w:val="17"/>
+              </w:rPr>
+              <w:t>+0.53</w:t>
+            </w:r>
+          </w:p>
+        </w:tc>
+        <w:tc>
+          <w:tcPr>
+            <w:tcW w:type="dxa" w:w="1234"/>
+          </w:tcPr>
+          <w:p>
+            <w:r>
+              <w:rPr>
+                <w:sz w:val="17"/>
+              </w:rPr>
+              <w:t>0.069</w:t>
+            </w:r>
+          </w:p>
+        </w:tc>
+        <w:tc>
+          <w:tcPr>
+            <w:tcW w:type="dxa" w:w="1234"/>
+          </w:tcPr>
+          <w:p>
+            <w:r>
+              <w:rPr>
+                <w:sz w:val="17"/>
+              </w:rPr>
+              <w:t>16</w:t>
+            </w:r>
+          </w:p>
+        </w:tc>
+      </w:tr>
+    </w:tbl>
+    <w:p/>
+    <w:p>
+      <w:r>
+        <w:rPr>
+          <w:b/>
+          <w:sz w:val="19"/>
+        </w:rPr>
+        <w:t>Tabela 9 — Fadiga mental (0–10): pré vs pós por dia</w:t>
+      </w:r>
+    </w:p>
+    <w:tbl>
+      <w:tblPr>
+        <w:tblStyle w:val="LightGrid-Accent1"/>
+        <w:tblW w:type="auto" w:w="0"/>
+        <w:jc w:val="center"/>
+        <w:tblLook w:firstColumn="1" w:firstRow="1" w:lastColumn="0" w:lastRow="0" w:noHBand="0" w:noVBand="1" w:val="04A0"/>
+      </w:tblPr>
+      <w:tblGrid>
+        <w:gridCol w:w="1234"/>
+        <w:gridCol w:w="1234"/>
+        <w:gridCol w:w="1234"/>
+        <w:gridCol w:w="1234"/>
+        <w:gridCol w:w="1234"/>
+        <w:gridCol w:w="1234"/>
+        <w:gridCol w:w="1234"/>
+      </w:tblGrid>
+      <w:tr>
+        <w:tc>
+          <w:tcPr>
+            <w:tcW w:type="dxa" w:w="1234"/>
+          </w:tcPr>
+          <w:p>
+            <w:r>
+              <w:rPr>
+                <w:b/>
+                <w:sz w:val="17"/>
+              </w:rPr>
+              <w:t>Dia</w:t>
+            </w:r>
+          </w:p>
+        </w:tc>
+        <w:tc>
+          <w:tcPr>
+            <w:tcW w:type="dxa" w:w="1234"/>
+          </w:tcPr>
+          <w:p>
+            <w:r>
+              <w:rPr>
+                <w:b/>
+                <w:sz w:val="17"/>
+              </w:rPr>
+              <w:t>Pré (m ± DP)</w:t>
+            </w:r>
+          </w:p>
+        </w:tc>
+        <w:tc>
+          <w:tcPr>
+            <w:tcW w:type="dxa" w:w="1234"/>
+          </w:tcPr>
+          <w:p>
+            <w:r>
+              <w:rPr>
+                <w:b/>
+                <w:sz w:val="17"/>
+              </w:rPr>
+              <w:t>Pós (m ± DP)</w:t>
+            </w:r>
+          </w:p>
+        </w:tc>
+        <w:tc>
+          <w:tcPr>
+            <w:tcW w:type="dxa" w:w="1234"/>
+          </w:tcPr>
+          <w:p>
+            <w:r>
+              <w:rPr>
+                <w:b/>
+                <w:sz w:val="17"/>
+              </w:rPr>
+              <w:t>Δ (pós−pré)</w:t>
+            </w:r>
+          </w:p>
+        </w:tc>
+        <w:tc>
+          <w:tcPr>
+            <w:tcW w:type="dxa" w:w="1234"/>
+          </w:tcPr>
+          <w:p>
+            <w:r>
+              <w:rPr>
+                <w:b/>
+                <w:sz w:val="17"/>
+              </w:rPr>
+              <w:t>dz</w:t>
+            </w:r>
+          </w:p>
+        </w:tc>
+        <w:tc>
+          <w:tcPr>
+            <w:tcW w:type="dxa" w:w="1234"/>
+          </w:tcPr>
+          <w:p>
+            <w:r>
+              <w:rPr>
+                <w:b/>
+                <w:sz w:val="17"/>
+              </w:rPr>
+              <w:t>p (Wilcoxon)</w:t>
+            </w:r>
+          </w:p>
+        </w:tc>
+        <w:tc>
+          <w:tcPr>
+            <w:tcW w:type="dxa" w:w="1234"/>
+          </w:tcPr>
+          <w:p>
+            <w:r>
+              <w:rPr>
+                <w:b/>
+                <w:sz w:val="17"/>
+              </w:rPr>
+              <w:t>n pares</w:t>
+            </w:r>
+          </w:p>
+        </w:tc>
+      </w:tr>
+      <w:tr>
+        <w:tc>
+          <w:tcPr>
+            <w:tcW w:type="dxa" w:w="1234"/>
+          </w:tcPr>
+          <w:p>
+            <w:r>
+              <w:rPr>
+                <w:sz w:val="17"/>
+              </w:rPr>
+              <w:t>D1</w:t>
+            </w:r>
+          </w:p>
+        </w:tc>
+        <w:tc>
+          <w:tcPr>
+            <w:tcW w:type="dxa" w:w="1234"/>
+          </w:tcPr>
+          <w:p>
+            <w:r>
+              <w:rPr>
+                <w:sz w:val="17"/>
+              </w:rPr>
+              <w:t>4.26 ± 2.05</w:t>
+            </w:r>
+          </w:p>
+        </w:tc>
+        <w:tc>
+          <w:tcPr>
+            <w:tcW w:type="dxa" w:w="1234"/>
+          </w:tcPr>
+          <w:p>
+            <w:r>
+              <w:rPr>
+                <w:sz w:val="17"/>
+              </w:rPr>
+              <w:t>5.80 ± 2.91</w:t>
+            </w:r>
+          </w:p>
+        </w:tc>
+        <w:tc>
+          <w:tcPr>
+            <w:tcW w:type="dxa" w:w="1234"/>
+          </w:tcPr>
+          <w:p>
+            <w:r>
+              <w:rPr>
+                <w:sz w:val="17"/>
+              </w:rPr>
+              <w:t>+1.54</w:t>
+            </w:r>
+          </w:p>
+        </w:tc>
+        <w:tc>
+          <w:tcPr>
+            <w:tcW w:type="dxa" w:w="1234"/>
+          </w:tcPr>
+          <w:p>
+            <w:r>
+              <w:rPr>
+                <w:sz w:val="17"/>
+              </w:rPr>
+              <w:t>+0.70</w:t>
+            </w:r>
+          </w:p>
+        </w:tc>
+        <w:tc>
+          <w:tcPr>
+            <w:tcW w:type="dxa" w:w="1234"/>
+          </w:tcPr>
+          <w:p>
+            <w:r>
+              <w:rPr>
+                <w:sz w:val="17"/>
+              </w:rPr>
+              <w:t>0.021 *</w:t>
+            </w:r>
+          </w:p>
+        </w:tc>
+        <w:tc>
+          <w:tcPr>
+            <w:tcW w:type="dxa" w:w="1234"/>
+          </w:tcPr>
+          <w:p>
+            <w:r>
+              <w:rPr>
+                <w:sz w:val="17"/>
+              </w:rPr>
+              <w:t>15</w:t>
+            </w:r>
+          </w:p>
+        </w:tc>
+      </w:tr>
+      <w:tr>
+        <w:tc>
+          <w:tcPr>
+            <w:tcW w:type="dxa" w:w="1234"/>
+          </w:tcPr>
+          <w:p>
+            <w:r>
+              <w:rPr>
+                <w:sz w:val="17"/>
+              </w:rPr>
+              <w:t>D2 (HIIT)</w:t>
+            </w:r>
+          </w:p>
+        </w:tc>
+        <w:tc>
+          <w:tcPr>
+            <w:tcW w:type="dxa" w:w="1234"/>
+          </w:tcPr>
+          <w:p>
+            <w:r>
+              <w:rPr>
+                <w:sz w:val="17"/>
+              </w:rPr>
+              <w:t>4.31 ± 2.72</w:t>
+            </w:r>
+          </w:p>
+        </w:tc>
+        <w:tc>
+          <w:tcPr>
+            <w:tcW w:type="dxa" w:w="1234"/>
+          </w:tcPr>
+          <w:p>
+            <w:r>
+              <w:rPr>
+                <w:sz w:val="17"/>
+              </w:rPr>
+              <w:t>4.73 ± 2.79</w:t>
+            </w:r>
+          </w:p>
+        </w:tc>
+        <w:tc>
+          <w:tcPr>
+            <w:tcW w:type="dxa" w:w="1234"/>
+          </w:tcPr>
+          <w:p>
+            <w:r>
+              <w:rPr>
+                <w:sz w:val="17"/>
+              </w:rPr>
+              <w:t>+0.42</w:t>
+            </w:r>
+          </w:p>
+        </w:tc>
+        <w:tc>
+          <w:tcPr>
+            <w:tcW w:type="dxa" w:w="1234"/>
+          </w:tcPr>
+          <w:p>
+            <w:r>
+              <w:rPr>
+                <w:sz w:val="17"/>
+              </w:rPr>
+              <w:t>+0.20</w:t>
+            </w:r>
+          </w:p>
+        </w:tc>
+        <w:tc>
+          <w:tcPr>
+            <w:tcW w:type="dxa" w:w="1234"/>
+          </w:tcPr>
+          <w:p>
+            <w:r>
+              <w:rPr>
+                <w:sz w:val="17"/>
+              </w:rPr>
+              <w:t>0.487</w:t>
+            </w:r>
+          </w:p>
+        </w:tc>
+        <w:tc>
+          <w:tcPr>
+            <w:tcW w:type="dxa" w:w="1234"/>
+          </w:tcPr>
+          <w:p>
+            <w:r>
+              <w:rPr>
+                <w:sz w:val="17"/>
+              </w:rPr>
+              <w:t>26</w:t>
+            </w:r>
+          </w:p>
+        </w:tc>
+      </w:tr>
+      <w:tr>
+        <w:tc>
+          <w:tcPr>
+            <w:tcW w:type="dxa" w:w="1234"/>
+          </w:tcPr>
+          <w:p>
+            <w:r>
+              <w:rPr>
+                <w:sz w:val="17"/>
+              </w:rPr>
+              <w:t>D3</w:t>
+            </w:r>
+          </w:p>
+        </w:tc>
+        <w:tc>
+          <w:tcPr>
+            <w:tcW w:type="dxa" w:w="1234"/>
+          </w:tcPr>
+          <w:p>
+            <w:r>
+              <w:rPr>
+                <w:sz w:val="17"/>
+              </w:rPr>
+              <w:t>4.42 ± 2.90</w:t>
+            </w:r>
+          </w:p>
+        </w:tc>
+        <w:tc>
+          <w:tcPr>
+            <w:tcW w:type="dxa" w:w="1234"/>
+          </w:tcPr>
+          <w:p>
+            <w:r>
+              <w:rPr>
+                <w:sz w:val="17"/>
+              </w:rPr>
+              <w:t>4.19 ± 2.86</w:t>
+            </w:r>
+          </w:p>
+        </w:tc>
+        <w:tc>
+          <w:tcPr>
+            <w:tcW w:type="dxa" w:w="1234"/>
+          </w:tcPr>
+          <w:p>
+            <w:r>
+              <w:rPr>
+                <w:sz w:val="17"/>
+              </w:rPr>
+              <w:t>-0.23</w:t>
+            </w:r>
+          </w:p>
+        </w:tc>
+        <w:tc>
+          <w:tcPr>
+            <w:tcW w:type="dxa" w:w="1234"/>
+          </w:tcPr>
+          <w:p>
+            <w:r>
+              <w:rPr>
+                <w:sz w:val="17"/>
+              </w:rPr>
+              <w:t>-0.16</w:t>
+            </w:r>
+          </w:p>
+        </w:tc>
+        <w:tc>
+          <w:tcPr>
+            <w:tcW w:type="dxa" w:w="1234"/>
+          </w:tcPr>
+          <w:p>
+            <w:r>
+              <w:rPr>
+                <w:sz w:val="17"/>
+              </w:rPr>
+              <w:t>0.274</w:t>
+            </w:r>
+          </w:p>
+        </w:tc>
+        <w:tc>
+          <w:tcPr>
+            <w:tcW w:type="dxa" w:w="1234"/>
+          </w:tcPr>
+          <w:p>
+            <w:r>
+              <w:rPr>
+                <w:sz w:val="17"/>
+              </w:rPr>
+              <w:t>21</w:t>
+            </w:r>
+          </w:p>
+        </w:tc>
+      </w:tr>
+      <w:tr>
+        <w:tc>
+          <w:tcPr>
+            <w:tcW w:type="dxa" w:w="1234"/>
+          </w:tcPr>
+          <w:p>
+            <w:r>
+              <w:rPr>
+                <w:sz w:val="17"/>
+              </w:rPr>
+              <w:t>D4 (HIIT)</w:t>
+            </w:r>
+          </w:p>
+        </w:tc>
+        <w:tc>
+          <w:tcPr>
+            <w:tcW w:type="dxa" w:w="1234"/>
+          </w:tcPr>
+          <w:p>
+            <w:r>
+              <w:rPr>
+                <w:sz w:val="17"/>
+              </w:rPr>
+              <w:t>4.14 ± 3.10</w:t>
+            </w:r>
+          </w:p>
+        </w:tc>
+        <w:tc>
+          <w:tcPr>
+            <w:tcW w:type="dxa" w:w="1234"/>
+          </w:tcPr>
+          <w:p>
+            <w:r>
+              <w:rPr>
+                <w:sz w:val="17"/>
+              </w:rPr>
+              <w:t>5.22 ± 2.49</w:t>
+            </w:r>
+          </w:p>
+        </w:tc>
+        <w:tc>
+          <w:tcPr>
+            <w:tcW w:type="dxa" w:w="1234"/>
+          </w:tcPr>
+          <w:p>
+            <w:r>
+              <w:rPr>
+                <w:sz w:val="17"/>
+              </w:rPr>
+              <w:t>+1.08</w:t>
+            </w:r>
+          </w:p>
+        </w:tc>
+        <w:tc>
+          <w:tcPr>
+            <w:tcW w:type="dxa" w:w="1234"/>
+          </w:tcPr>
+          <w:p>
+            <w:r>
+              <w:rPr>
+                <w:sz w:val="17"/>
+              </w:rPr>
+              <w:t>+0.29</w:t>
+            </w:r>
+          </w:p>
+        </w:tc>
+        <w:tc>
+          <w:tcPr>
+            <w:tcW w:type="dxa" w:w="1234"/>
+          </w:tcPr>
+          <w:p>
+            <w:r>
+              <w:rPr>
+                <w:sz w:val="17"/>
+              </w:rPr>
+              <w:t>0.275</w:t>
+            </w:r>
+          </w:p>
+        </w:tc>
+        <w:tc>
+          <w:tcPr>
+            <w:tcW w:type="dxa" w:w="1234"/>
+          </w:tcPr>
+          <w:p>
+            <w:r>
+              <w:rPr>
+                <w:sz w:val="17"/>
+              </w:rPr>
+              <w:t>18</w:t>
+            </w:r>
+          </w:p>
+        </w:tc>
+      </w:tr>
+      <w:tr>
+        <w:tc>
+          <w:tcPr>
+            <w:tcW w:type="dxa" w:w="1234"/>
+          </w:tcPr>
+          <w:p>
+            <w:r>
+              <w:rPr>
+                <w:sz w:val="17"/>
+              </w:rPr>
+              <w:t>D5</w:t>
+            </w:r>
+          </w:p>
+        </w:tc>
+        <w:tc>
+          <w:tcPr>
+            <w:tcW w:type="dxa" w:w="1234"/>
+          </w:tcPr>
+          <w:p>
+            <w:r>
+              <w:rPr>
+                <w:sz w:val="17"/>
+              </w:rPr>
+              <w:t>4.26 ± 2.85</w:t>
+            </w:r>
+          </w:p>
+        </w:tc>
+        <w:tc>
+          <w:tcPr>
+            <w:tcW w:type="dxa" w:w="1234"/>
+          </w:tcPr>
+          <w:p>
+            <w:r>
+              <w:rPr>
+                <w:sz w:val="17"/>
+              </w:rPr>
+              <w:t>4.37 ± 3.20</w:t>
+            </w:r>
+          </w:p>
+        </w:tc>
+        <w:tc>
+          <w:tcPr>
+            <w:tcW w:type="dxa" w:w="1234"/>
+          </w:tcPr>
+          <w:p>
+            <w:r>
+              <w:rPr>
+                <w:sz w:val="17"/>
+              </w:rPr>
+              <w:t>+0.11</w:t>
+            </w:r>
+          </w:p>
+        </w:tc>
+        <w:tc>
+          <w:tcPr>
+            <w:tcW w:type="dxa" w:w="1234"/>
+          </w:tcPr>
+          <w:p>
+            <w:r>
+              <w:rPr>
+                <w:sz w:val="17"/>
+              </w:rPr>
+              <w:t>+0.23</w:t>
+            </w:r>
+          </w:p>
+        </w:tc>
+        <w:tc>
+          <w:tcPr>
+            <w:tcW w:type="dxa" w:w="1234"/>
+          </w:tcPr>
+          <w:p>
+            <w:r>
+              <w:rPr>
+                <w:sz w:val="17"/>
+              </w:rPr>
+              <w:t>0.473</w:t>
+            </w:r>
+          </w:p>
+        </w:tc>
+        <w:tc>
+          <w:tcPr>
+            <w:tcW w:type="dxa" w:w="1234"/>
+          </w:tcPr>
+          <w:p>
+            <w:r>
+              <w:rPr>
+                <w:sz w:val="17"/>
+              </w:rPr>
+              <w:t>19</w:t>
+            </w:r>
+          </w:p>
+        </w:tc>
+      </w:tr>
+      <w:tr>
+        <w:tc>
+          <w:tcPr>
+            <w:tcW w:type="dxa" w:w="1234"/>
+          </w:tcPr>
+          <w:p>
+            <w:r>
+              <w:rPr>
+                <w:sz w:val="17"/>
+              </w:rPr>
+              <w:t>D6</w:t>
+            </w:r>
+          </w:p>
+        </w:tc>
+        <w:tc>
+          <w:tcPr>
+            <w:tcW w:type="dxa" w:w="1234"/>
+          </w:tcPr>
+          <w:p>
+            <w:r>
+              <w:rPr>
+                <w:sz w:val="17"/>
+              </w:rPr>
+              <w:t>4.36 ± 3.03</w:t>
+            </w:r>
+          </w:p>
+        </w:tc>
+        <w:tc>
+          <w:tcPr>
+            <w:tcW w:type="dxa" w:w="1234"/>
+          </w:tcPr>
+          <w:p>
+            <w:r>
+              <w:rPr>
+                <w:sz w:val="17"/>
+              </w:rPr>
+              <w:t>5.20 ± 3.24</w:t>
+            </w:r>
+          </w:p>
+        </w:tc>
+        <w:tc>
+          <w:tcPr>
+            <w:tcW w:type="dxa" w:w="1234"/>
+          </w:tcPr>
+          <w:p>
+            <w:r>
+              <w:rPr>
+                <w:sz w:val="17"/>
+              </w:rPr>
+              <w:t>+0.84</w:t>
+            </w:r>
+          </w:p>
+        </w:tc>
+        <w:tc>
+          <w:tcPr>
+            <w:tcW w:type="dxa" w:w="1234"/>
+          </w:tcPr>
+          <w:p>
+            <w:r>
+              <w:rPr>
+                <w:sz w:val="17"/>
+              </w:rPr>
+              <w:t>+0.37</w:t>
+            </w:r>
+          </w:p>
+        </w:tc>
+        <w:tc>
+          <w:tcPr>
+            <w:tcW w:type="dxa" w:w="1234"/>
+          </w:tcPr>
+          <w:p>
+            <w:r>
+              <w:rPr>
+                <w:sz w:val="17"/>
+              </w:rPr>
+              <w:t>0.084</w:t>
+            </w:r>
+          </w:p>
+        </w:tc>
+        <w:tc>
+          <w:tcPr>
+            <w:tcW w:type="dxa" w:w="1234"/>
+          </w:tcPr>
+          <w:p>
+            <w:r>
+              <w:rPr>
+                <w:sz w:val="17"/>
+              </w:rPr>
+              <w:t>20</w:t>
+            </w:r>
+          </w:p>
+        </w:tc>
+      </w:tr>
+      <w:tr>
+        <w:tc>
+          <w:tcPr>
+            <w:tcW w:type="dxa" w:w="1234"/>
+          </w:tcPr>
+          <w:p>
+            <w:r>
+              <w:rPr>
+                <w:sz w:val="17"/>
+              </w:rPr>
+              <w:t>D7 (HIIT)</w:t>
+            </w:r>
+          </w:p>
+        </w:tc>
+        <w:tc>
+          <w:tcPr>
+            <w:tcW w:type="dxa" w:w="1234"/>
+          </w:tcPr>
+          <w:p>
+            <w:r>
+              <w:rPr>
+                <w:sz w:val="17"/>
+              </w:rPr>
+              <w:t>4.71 ± 3.04</w:t>
+            </w:r>
+          </w:p>
+        </w:tc>
+        <w:tc>
+          <w:tcPr>
+            <w:tcW w:type="dxa" w:w="1234"/>
+          </w:tcPr>
+          <w:p>
+            <w:r>
+              <w:rPr>
+                <w:sz w:val="17"/>
+              </w:rPr>
+              <w:t>5.56 ± 3.14</w:t>
+            </w:r>
+          </w:p>
+        </w:tc>
+        <w:tc>
+          <w:tcPr>
+            <w:tcW w:type="dxa" w:w="1234"/>
+          </w:tcPr>
+          <w:p>
+            <w:r>
+              <w:rPr>
+                <w:sz w:val="17"/>
+              </w:rPr>
+              <w:t>+0.85</w:t>
+            </w:r>
+          </w:p>
+        </w:tc>
+        <w:tc>
+          <w:tcPr>
+            <w:tcW w:type="dxa" w:w="1234"/>
+          </w:tcPr>
+          <w:p>
+            <w:r>
+              <w:rPr>
+                <w:sz w:val="17"/>
+              </w:rPr>
+              <w:t>+0.57</w:t>
+            </w:r>
+          </w:p>
+        </w:tc>
+        <w:tc>
+          <w:tcPr>
+            <w:tcW w:type="dxa" w:w="1234"/>
+          </w:tcPr>
+          <w:p>
+            <w:r>
+              <w:rPr>
+                <w:sz w:val="17"/>
+              </w:rPr>
+              <w:t>0.043 *</w:t>
+            </w:r>
+          </w:p>
+        </w:tc>
+        <w:tc>
+          <w:tcPr>
+            <w:tcW w:type="dxa" w:w="1234"/>
+          </w:tcPr>
+          <w:p>
+            <w:r>
+              <w:rPr>
+                <w:sz w:val="17"/>
+              </w:rPr>
+              <w:t>16</w:t>
+            </w:r>
+          </w:p>
+        </w:tc>
+      </w:tr>
+    </w:tbl>
+    <w:p/>
+    <w:p>
+      <w:r>
+        <w:rPr>
+          <w:b w:val="0"/>
+          <w:i w:val="0"/>
+        </w:rPr>
+        <w:t>Padrão comum às quatro variáveis: a maior resposta aguda pré→pós ocorre no Dia 1 (a primeira sessão, efeito de novidade/choque inicial) e reaparece na segunda metade da semana (D6–D7). O Vigor cai (Δ negativo) e Fadiga/TMD/Fadiga mental sobem (Δ positivo) após o treino. Nem todo dia atinge significância pareada — a resposta aguda isolada é modesta; o sinal robusto está no acúmulo semanal (§2) e não na sessão isolada, coerente com a AUC ≈ 0,5 para discriminar a sessão de HIIT vs 0,86 para o acúmulo.</w:t>
+      </w:r>
+    </w:p>
+    <w:p>
+      <w:pPr>
+        <w:jc w:val="center"/>
+      </w:pPr>
+      <w:r>
+        <w:drawing>
+          <wp:inline xmlns:a="http://schemas.openxmlformats.org/drawingml/2006/main" xmlns:pic="http://schemas.openxmlformats.org/drawingml/2006/picture">
+            <wp:extent cx="5852160" cy="3291840"/>
+            <wp:docPr id="6" name="Picture 6"/>
+            <wp:cNvGraphicFramePr>
+              <a:graphicFrameLocks noChangeAspect="1"/>
+            </wp:cNvGraphicFramePr>
+            <a:graphic>
+              <a:graphicData uri="http://schemas.openxmlformats.org/drawingml/2006/picture">
+                <pic:pic>
+                  <pic:nvPicPr>
+                    <pic:cNvPr id="0" name="adx6_prepos_dia.png"/>
+                    <pic:cNvPicPr/>
+                  </pic:nvPicPr>
+                  <pic:blipFill>
+                    <a:blip r:embed="rId14"/>
+                    <a:stretch>
+                      <a:fillRect/>
+                    </a:stretch>
+                  </pic:blipFill>
+                  <pic:spPr>
+                    <a:xfrm>
+                      <a:off x="0" y="0"/>
+                      <a:ext cx="5852160" cy="3291840"/>
+                    </a:xfrm>
+                    <a:prstGeom prst="rect"/>
+                  </pic:spPr>
+                </pic:pic>
+              </a:graphicData>
+            </a:graphic>
+          </wp:inline>
+        </w:drawing>
+      </w:r>
+    </w:p>
+    <w:p>
+      <w:pPr>
+        <w:jc w:val="center"/>
+      </w:pPr>
+      <w:r>
+        <w:rPr>
+          <w:i/>
+          <w:sz w:val="17"/>
+        </w:rPr>
+        <w:t>Fig 6 — Pré (azul) vs pós por dia, média ± DP, para cada variável. * marca os dias com Wilcoxon pareado p&lt;0,05. O Vigor diminui e Fadiga/TMD/Fadiga mental aumentam pós-treino; a resposta é mais nítida no D1 e no fim da semana.</w:t>
+      </w:r>
+    </w:p>
+    <w:p>
+      <w:pPr>
+        <w:pStyle w:val="Heading1"/>
+      </w:pPr>
+      <w:r>
+        <w:t>6. Veredito em dois níveis — grupo vs indivíduo</w:t>
+      </w:r>
+    </w:p>
+    <w:p>
+      <w:r>
+        <w:rPr>
+          <w:b/>
+          <w:sz w:val="19"/>
+        </w:rPr>
+        <w:t>Tabela 10 — A oscilação semanal supera o ruído?</w:t>
       </w:r>
     </w:p>
     <w:tbl>
@@ -3527,7 +6716,7 @@
         <w:pStyle w:val="Heading1"/>
       </w:pPr>
       <w:r>
-        <w:t>6. Síntese</w:t>
+        <w:t>7. Síntese</w:t>
       </w:r>
     </w:p>
     <w:p>

</xml_diff>

<commit_message>
Add mid (intra-session) phase to the pre/post-by-day tables
Section 5 now reports pré → mid → pós per day for each variable, where mid is
the intra-session measurement between pre and post (aggregated to one value per
athlete). Each table adds a Mid (m ± SD) column and a Friedman pré/mid/pós
p-value alongside the paired pré×pós Wilcoxon; the Fig 6 bars now show three
phases per day. Day 1 (baseline) has no mid.

The mid phase reveals the within-session course is not always monotonic: fatigue
often peaks mid-session and recovers slightly by post (e.g. Fadiga BRUMS D7:
6.8 -> 8.6 -> 7.8; TMD D4: 3.1 -> 7.1 -> 7.2).

Reproducible: scripts/analise/prepost_compute.py, build_amp_docx.py.
Athletes anonymized; no raw data committed.

Co-Authored-By: Claude Opus 4.8 <noreply@anthropic.com>
Claude-Session: https://claude.ai/code/session_01P7yGiDeoGDyjWvPWQVsUrj
</commit_message>
<xml_diff>
--- a/Artigos/Amplitude_Ruido_Sinal_Vigor_Fadiga_TMD.docx
+++ b/Artigos/Amplitude_Ruido_Sinal_Vigor_Fadiga_TMD.docx
@@ -3078,7 +3078,7 @@
         <w:pStyle w:val="Heading1"/>
       </w:pPr>
       <w:r>
-        <w:t>5. Pré e pós por dia — cada variável</w:t>
+        <w:t>5. Pré → mid → pós por dia — cada variável</w:t>
       </w:r>
     </w:p>
     <w:p>
@@ -3087,7 +3087,7 @@
           <w:b w:val="0"/>
           <w:i w:val="0"/>
         </w:rPr>
-        <w:t>Resposta aguda dentro de cada dia: média ± DP de pré e pós, variação Δ (pós−pré), tamanho de efeito pareado dz e Wilcoxon pareado por atleta. Dias de HIIT: 2, 4 e 7. Valores em negrito de p indicam significância (p&lt;0,05).</w:t>
+        <w:t>Resposta aguda dentro de cada dia, agora com a fase intermediária (mid, medida intra-sessão entre pré e pós): média ± DP de pré, mid e pós, variação Δ (pós−pré), tamanho de efeito pareado dz, Wilcoxon pareado pré×pós e Friedman pré/mid/pós (quando há mid). Dias de HIIT: 2, 4 e 7. O Dia 1 (baseline) não tem coleta mid. * indica p&lt;0,05.</w:t>
       </w:r>
     </w:p>
     <w:p>
@@ -3096,7 +3096,7 @@
           <w:b/>
           <w:sz w:val="19"/>
         </w:rPr>
-        <w:t>Tabela 6 — Vigor (0–20): pré vs pós por dia</w:t>
+        <w:t>Tabela 6 — Vigor (0–20): pré → mid → pós por dia</w:t>
       </w:r>
     </w:p>
     <w:tbl>
@@ -3107,18 +3107,19 @@
         <w:tblLook w:firstColumn="1" w:firstRow="1" w:lastColumn="0" w:lastRow="0" w:noHBand="0" w:noVBand="1" w:val="04A0"/>
       </w:tblPr>
       <w:tblGrid>
-        <w:gridCol w:w="1234"/>
-        <w:gridCol w:w="1234"/>
-        <w:gridCol w:w="1234"/>
-        <w:gridCol w:w="1234"/>
-        <w:gridCol w:w="1234"/>
-        <w:gridCol w:w="1234"/>
-        <w:gridCol w:w="1234"/>
+        <w:gridCol w:w="1080"/>
+        <w:gridCol w:w="1080"/>
+        <w:gridCol w:w="1080"/>
+        <w:gridCol w:w="1080"/>
+        <w:gridCol w:w="1080"/>
+        <w:gridCol w:w="1080"/>
+        <w:gridCol w:w="1080"/>
+        <w:gridCol w:w="1080"/>
       </w:tblGrid>
       <w:tr>
         <w:tc>
           <w:tcPr>
-            <w:tcW w:type="dxa" w:w="1234"/>
+            <w:tcW w:type="dxa" w:w="1080"/>
           </w:tcPr>
           <w:p>
             <w:r>
@@ -3132,7 +3133,7 @@
         </w:tc>
         <w:tc>
           <w:tcPr>
-            <w:tcW w:type="dxa" w:w="1234"/>
+            <w:tcW w:type="dxa" w:w="1080"/>
           </w:tcPr>
           <w:p>
             <w:r>
@@ -3146,7 +3147,7 @@
         </w:tc>
         <w:tc>
           <w:tcPr>
-            <w:tcW w:type="dxa" w:w="1234"/>
+            <w:tcW w:type="dxa" w:w="1080"/>
           </w:tcPr>
           <w:p>
             <w:r>
@@ -3154,13 +3155,27 @@
                 <w:b/>
                 <w:sz w:val="17"/>
               </w:rPr>
+              <w:t>Mid (m ± DP)</w:t>
+            </w:r>
+          </w:p>
+        </w:tc>
+        <w:tc>
+          <w:tcPr>
+            <w:tcW w:type="dxa" w:w="1080"/>
+          </w:tcPr>
+          <w:p>
+            <w:r>
+              <w:rPr>
+                <w:b/>
+                <w:sz w:val="17"/>
+              </w:rPr>
               <w:t>Pós (m ± DP)</w:t>
             </w:r>
           </w:p>
         </w:tc>
         <w:tc>
           <w:tcPr>
-            <w:tcW w:type="dxa" w:w="1234"/>
+            <w:tcW w:type="dxa" w:w="1080"/>
           </w:tcPr>
           <w:p>
             <w:r>
@@ -3174,7 +3189,7 @@
         </w:tc>
         <w:tc>
           <w:tcPr>
-            <w:tcW w:type="dxa" w:w="1234"/>
+            <w:tcW w:type="dxa" w:w="1080"/>
           </w:tcPr>
           <w:p>
             <w:r>
@@ -3188,7 +3203,7 @@
         </w:tc>
         <w:tc>
           <w:tcPr>
-            <w:tcW w:type="dxa" w:w="1234"/>
+            <w:tcW w:type="dxa" w:w="1080"/>
           </w:tcPr>
           <w:p>
             <w:r>
@@ -3196,13 +3211,13 @@
                 <w:b/>
                 <w:sz w:val="17"/>
               </w:rPr>
-              <w:t>p (Wilcoxon)</w:t>
-            </w:r>
-          </w:p>
-        </w:tc>
-        <w:tc>
-          <w:tcPr>
-            <w:tcW w:type="dxa" w:w="1234"/>
+              <w:t>p pré×pós</w:t>
+            </w:r>
+          </w:p>
+        </w:tc>
+        <w:tc>
+          <w:tcPr>
+            <w:tcW w:type="dxa" w:w="1080"/>
           </w:tcPr>
           <w:p>
             <w:r>
@@ -3210,7 +3225,7 @@
                 <w:b/>
                 <w:sz w:val="17"/>
               </w:rPr>
-              <w:t>n pares</w:t>
+              <w:t>p Friedman</w:t>
             </w:r>
           </w:p>
         </w:tc>
@@ -3218,7 +3233,7 @@
       <w:tr>
         <w:tc>
           <w:tcPr>
-            <w:tcW w:type="dxa" w:w="1234"/>
+            <w:tcW w:type="dxa" w:w="1080"/>
           </w:tcPr>
           <w:p>
             <w:r>
@@ -3231,7 +3246,7 @@
         </w:tc>
         <w:tc>
           <w:tcPr>
-            <w:tcW w:type="dxa" w:w="1234"/>
+            <w:tcW w:type="dxa" w:w="1080"/>
           </w:tcPr>
           <w:p>
             <w:r>
@@ -3244,7 +3259,20 @@
         </w:tc>
         <w:tc>
           <w:tcPr>
-            <w:tcW w:type="dxa" w:w="1234"/>
+            <w:tcW w:type="dxa" w:w="1080"/>
+          </w:tcPr>
+          <w:p>
+            <w:r>
+              <w:rPr>
+                <w:sz w:val="17"/>
+              </w:rPr>
+              <w:t>—</w:t>
+            </w:r>
+          </w:p>
+        </w:tc>
+        <w:tc>
+          <w:tcPr>
+            <w:tcW w:type="dxa" w:w="1080"/>
           </w:tcPr>
           <w:p>
             <w:r>
@@ -3257,7 +3285,7 @@
         </w:tc>
         <w:tc>
           <w:tcPr>
-            <w:tcW w:type="dxa" w:w="1234"/>
+            <w:tcW w:type="dxa" w:w="1080"/>
           </w:tcPr>
           <w:p>
             <w:r>
@@ -3270,7 +3298,7 @@
         </w:tc>
         <w:tc>
           <w:tcPr>
-            <w:tcW w:type="dxa" w:w="1234"/>
+            <w:tcW w:type="dxa" w:w="1080"/>
           </w:tcPr>
           <w:p>
             <w:r>
@@ -3283,7 +3311,7 @@
         </w:tc>
         <w:tc>
           <w:tcPr>
-            <w:tcW w:type="dxa" w:w="1234"/>
+            <w:tcW w:type="dxa" w:w="1080"/>
           </w:tcPr>
           <w:p>
             <w:r>
@@ -3296,14 +3324,14 @@
         </w:tc>
         <w:tc>
           <w:tcPr>
-            <w:tcW w:type="dxa" w:w="1234"/>
-          </w:tcPr>
-          <w:p>
-            <w:r>
-              <w:rPr>
-                <w:sz w:val="17"/>
-              </w:rPr>
-              <w:t>15</w:t>
+            <w:tcW w:type="dxa" w:w="1080"/>
+          </w:tcPr>
+          <w:p>
+            <w:r>
+              <w:rPr>
+                <w:sz w:val="17"/>
+              </w:rPr>
+              <w:t>—</w:t>
             </w:r>
           </w:p>
         </w:tc>
@@ -3311,7 +3339,7 @@
       <w:tr>
         <w:tc>
           <w:tcPr>
-            <w:tcW w:type="dxa" w:w="1234"/>
+            <w:tcW w:type="dxa" w:w="1080"/>
           </w:tcPr>
           <w:p>
             <w:r>
@@ -3324,7 +3352,7 @@
         </w:tc>
         <w:tc>
           <w:tcPr>
-            <w:tcW w:type="dxa" w:w="1234"/>
+            <w:tcW w:type="dxa" w:w="1080"/>
           </w:tcPr>
           <w:p>
             <w:r>
@@ -3337,7 +3365,20 @@
         </w:tc>
         <w:tc>
           <w:tcPr>
-            <w:tcW w:type="dxa" w:w="1234"/>
+            <w:tcW w:type="dxa" w:w="1080"/>
+          </w:tcPr>
+          <w:p>
+            <w:r>
+              <w:rPr>
+                <w:sz w:val="17"/>
+              </w:rPr>
+              <w:t>5.87 ± 2.57</w:t>
+            </w:r>
+          </w:p>
+        </w:tc>
+        <w:tc>
+          <w:tcPr>
+            <w:tcW w:type="dxa" w:w="1080"/>
           </w:tcPr>
           <w:p>
             <w:r>
@@ -3350,7 +3391,7 @@
         </w:tc>
         <w:tc>
           <w:tcPr>
-            <w:tcW w:type="dxa" w:w="1234"/>
+            <w:tcW w:type="dxa" w:w="1080"/>
           </w:tcPr>
           <w:p>
             <w:r>
@@ -3363,7 +3404,7 @@
         </w:tc>
         <w:tc>
           <w:tcPr>
-            <w:tcW w:type="dxa" w:w="1234"/>
+            <w:tcW w:type="dxa" w:w="1080"/>
           </w:tcPr>
           <w:p>
             <w:r>
@@ -3376,7 +3417,7 @@
         </w:tc>
         <w:tc>
           <w:tcPr>
-            <w:tcW w:type="dxa" w:w="1234"/>
+            <w:tcW w:type="dxa" w:w="1080"/>
           </w:tcPr>
           <w:p>
             <w:r>
@@ -3389,14 +3430,14 @@
         </w:tc>
         <w:tc>
           <w:tcPr>
-            <w:tcW w:type="dxa" w:w="1234"/>
-          </w:tcPr>
-          <w:p>
-            <w:r>
-              <w:rPr>
-                <w:sz w:val="17"/>
-              </w:rPr>
-              <w:t>26</w:t>
+            <w:tcW w:type="dxa" w:w="1080"/>
+          </w:tcPr>
+          <w:p>
+            <w:r>
+              <w:rPr>
+                <w:sz w:val="17"/>
+              </w:rPr>
+              <w:t>0.358</w:t>
             </w:r>
           </w:p>
         </w:tc>
@@ -3404,7 +3445,7 @@
       <w:tr>
         <w:tc>
           <w:tcPr>
-            <w:tcW w:type="dxa" w:w="1234"/>
+            <w:tcW w:type="dxa" w:w="1080"/>
           </w:tcPr>
           <w:p>
             <w:r>
@@ -3417,7 +3458,7 @@
         </w:tc>
         <w:tc>
           <w:tcPr>
-            <w:tcW w:type="dxa" w:w="1234"/>
+            <w:tcW w:type="dxa" w:w="1080"/>
           </w:tcPr>
           <w:p>
             <w:r>
@@ -3430,7 +3471,20 @@
         </w:tc>
         <w:tc>
           <w:tcPr>
-            <w:tcW w:type="dxa" w:w="1234"/>
+            <w:tcW w:type="dxa" w:w="1080"/>
+          </w:tcPr>
+          <w:p>
+            <w:r>
+              <w:rPr>
+                <w:sz w:val="17"/>
+              </w:rPr>
+              <w:t>5.32 ± 2.73</w:t>
+            </w:r>
+          </w:p>
+        </w:tc>
+        <w:tc>
+          <w:tcPr>
+            <w:tcW w:type="dxa" w:w="1080"/>
           </w:tcPr>
           <w:p>
             <w:r>
@@ -3443,7 +3497,7 @@
         </w:tc>
         <w:tc>
           <w:tcPr>
-            <w:tcW w:type="dxa" w:w="1234"/>
+            <w:tcW w:type="dxa" w:w="1080"/>
           </w:tcPr>
           <w:p>
             <w:r>
@@ -3456,7 +3510,7 @@
         </w:tc>
         <w:tc>
           <w:tcPr>
-            <w:tcW w:type="dxa" w:w="1234"/>
+            <w:tcW w:type="dxa" w:w="1080"/>
           </w:tcPr>
           <w:p>
             <w:r>
@@ -3469,7 +3523,7 @@
         </w:tc>
         <w:tc>
           <w:tcPr>
-            <w:tcW w:type="dxa" w:w="1234"/>
+            <w:tcW w:type="dxa" w:w="1080"/>
           </w:tcPr>
           <w:p>
             <w:r>
@@ -3482,14 +3536,14 @@
         </w:tc>
         <w:tc>
           <w:tcPr>
-            <w:tcW w:type="dxa" w:w="1234"/>
-          </w:tcPr>
-          <w:p>
-            <w:r>
-              <w:rPr>
-                <w:sz w:val="17"/>
-              </w:rPr>
-              <w:t>21</w:t>
+            <w:tcW w:type="dxa" w:w="1080"/>
+          </w:tcPr>
+          <w:p>
+            <w:r>
+              <w:rPr>
+                <w:sz w:val="17"/>
+              </w:rPr>
+              <w:t>0.869</w:t>
             </w:r>
           </w:p>
         </w:tc>
@@ -3497,7 +3551,7 @@
       <w:tr>
         <w:tc>
           <w:tcPr>
-            <w:tcW w:type="dxa" w:w="1234"/>
+            <w:tcW w:type="dxa" w:w="1080"/>
           </w:tcPr>
           <w:p>
             <w:r>
@@ -3510,7 +3564,7 @@
         </w:tc>
         <w:tc>
           <w:tcPr>
-            <w:tcW w:type="dxa" w:w="1234"/>
+            <w:tcW w:type="dxa" w:w="1080"/>
           </w:tcPr>
           <w:p>
             <w:r>
@@ -3523,7 +3577,20 @@
         </w:tc>
         <w:tc>
           <w:tcPr>
-            <w:tcW w:type="dxa" w:w="1234"/>
+            <w:tcW w:type="dxa" w:w="1080"/>
+          </w:tcPr>
+          <w:p>
+            <w:r>
+              <w:rPr>
+                <w:sz w:val="17"/>
+              </w:rPr>
+              <w:t>4.77 ± 2.46</w:t>
+            </w:r>
+          </w:p>
+        </w:tc>
+        <w:tc>
+          <w:tcPr>
+            <w:tcW w:type="dxa" w:w="1080"/>
           </w:tcPr>
           <w:p>
             <w:r>
@@ -3536,7 +3603,7 @@
         </w:tc>
         <w:tc>
           <w:tcPr>
-            <w:tcW w:type="dxa" w:w="1234"/>
+            <w:tcW w:type="dxa" w:w="1080"/>
           </w:tcPr>
           <w:p>
             <w:r>
@@ -3549,7 +3616,7 @@
         </w:tc>
         <w:tc>
           <w:tcPr>
-            <w:tcW w:type="dxa" w:w="1234"/>
+            <w:tcW w:type="dxa" w:w="1080"/>
           </w:tcPr>
           <w:p>
             <w:r>
@@ -3562,7 +3629,7 @@
         </w:tc>
         <w:tc>
           <w:tcPr>
-            <w:tcW w:type="dxa" w:w="1234"/>
+            <w:tcW w:type="dxa" w:w="1080"/>
           </w:tcPr>
           <w:p>
             <w:r>
@@ -3575,14 +3642,14 @@
         </w:tc>
         <w:tc>
           <w:tcPr>
-            <w:tcW w:type="dxa" w:w="1234"/>
-          </w:tcPr>
-          <w:p>
-            <w:r>
-              <w:rPr>
-                <w:sz w:val="17"/>
-              </w:rPr>
-              <w:t>18</w:t>
+            <w:tcW w:type="dxa" w:w="1080"/>
+          </w:tcPr>
+          <w:p>
+            <w:r>
+              <w:rPr>
+                <w:sz w:val="17"/>
+              </w:rPr>
+              <w:t>0.234</w:t>
             </w:r>
           </w:p>
         </w:tc>
@@ -3590,7 +3657,7 @@
       <w:tr>
         <w:tc>
           <w:tcPr>
-            <w:tcW w:type="dxa" w:w="1234"/>
+            <w:tcW w:type="dxa" w:w="1080"/>
           </w:tcPr>
           <w:p>
             <w:r>
@@ -3603,7 +3670,7 @@
         </w:tc>
         <w:tc>
           <w:tcPr>
-            <w:tcW w:type="dxa" w:w="1234"/>
+            <w:tcW w:type="dxa" w:w="1080"/>
           </w:tcPr>
           <w:p>
             <w:r>
@@ -3616,7 +3683,20 @@
         </w:tc>
         <w:tc>
           <w:tcPr>
-            <w:tcW w:type="dxa" w:w="1234"/>
+            <w:tcW w:type="dxa" w:w="1080"/>
+          </w:tcPr>
+          <w:p>
+            <w:r>
+              <w:rPr>
+                <w:sz w:val="17"/>
+              </w:rPr>
+              <w:t>5.97 ± 2.66</w:t>
+            </w:r>
+          </w:p>
+        </w:tc>
+        <w:tc>
+          <w:tcPr>
+            <w:tcW w:type="dxa" w:w="1080"/>
           </w:tcPr>
           <w:p>
             <w:r>
@@ -3629,7 +3709,7 @@
         </w:tc>
         <w:tc>
           <w:tcPr>
-            <w:tcW w:type="dxa" w:w="1234"/>
+            <w:tcW w:type="dxa" w:w="1080"/>
           </w:tcPr>
           <w:p>
             <w:r>
@@ -3642,7 +3722,7 @@
         </w:tc>
         <w:tc>
           <w:tcPr>
-            <w:tcW w:type="dxa" w:w="1234"/>
+            <w:tcW w:type="dxa" w:w="1080"/>
           </w:tcPr>
           <w:p>
             <w:r>
@@ -3655,7 +3735,7 @@
         </w:tc>
         <w:tc>
           <w:tcPr>
-            <w:tcW w:type="dxa" w:w="1234"/>
+            <w:tcW w:type="dxa" w:w="1080"/>
           </w:tcPr>
           <w:p>
             <w:r>
@@ -3668,14 +3748,14 @@
         </w:tc>
         <w:tc>
           <w:tcPr>
-            <w:tcW w:type="dxa" w:w="1234"/>
-          </w:tcPr>
-          <w:p>
-            <w:r>
-              <w:rPr>
-                <w:sz w:val="17"/>
-              </w:rPr>
-              <w:t>19</w:t>
+            <w:tcW w:type="dxa" w:w="1080"/>
+          </w:tcPr>
+          <w:p>
+            <w:r>
+              <w:rPr>
+                <w:sz w:val="17"/>
+              </w:rPr>
+              <w:t>0.853</w:t>
             </w:r>
           </w:p>
         </w:tc>
@@ -3683,7 +3763,7 @@
       <w:tr>
         <w:tc>
           <w:tcPr>
-            <w:tcW w:type="dxa" w:w="1234"/>
+            <w:tcW w:type="dxa" w:w="1080"/>
           </w:tcPr>
           <w:p>
             <w:r>
@@ -3696,7 +3776,7 @@
         </w:tc>
         <w:tc>
           <w:tcPr>
-            <w:tcW w:type="dxa" w:w="1234"/>
+            <w:tcW w:type="dxa" w:w="1080"/>
           </w:tcPr>
           <w:p>
             <w:r>
@@ -3709,7 +3789,20 @@
         </w:tc>
         <w:tc>
           <w:tcPr>
-            <w:tcW w:type="dxa" w:w="1234"/>
+            <w:tcW w:type="dxa" w:w="1080"/>
+          </w:tcPr>
+          <w:p>
+            <w:r>
+              <w:rPr>
+                <w:sz w:val="17"/>
+              </w:rPr>
+              <w:t>5.69 ± 3.03</w:t>
+            </w:r>
+          </w:p>
+        </w:tc>
+        <w:tc>
+          <w:tcPr>
+            <w:tcW w:type="dxa" w:w="1080"/>
           </w:tcPr>
           <w:p>
             <w:r>
@@ -3722,7 +3815,7 @@
         </w:tc>
         <w:tc>
           <w:tcPr>
-            <w:tcW w:type="dxa" w:w="1234"/>
+            <w:tcW w:type="dxa" w:w="1080"/>
           </w:tcPr>
           <w:p>
             <w:r>
@@ -3735,7 +3828,7 @@
         </w:tc>
         <w:tc>
           <w:tcPr>
-            <w:tcW w:type="dxa" w:w="1234"/>
+            <w:tcW w:type="dxa" w:w="1080"/>
           </w:tcPr>
           <w:p>
             <w:r>
@@ -3748,7 +3841,7 @@
         </w:tc>
         <w:tc>
           <w:tcPr>
-            <w:tcW w:type="dxa" w:w="1234"/>
+            <w:tcW w:type="dxa" w:w="1080"/>
           </w:tcPr>
           <w:p>
             <w:r>
@@ -3761,14 +3854,14 @@
         </w:tc>
         <w:tc>
           <w:tcPr>
-            <w:tcW w:type="dxa" w:w="1234"/>
-          </w:tcPr>
-          <w:p>
-            <w:r>
-              <w:rPr>
-                <w:sz w:val="17"/>
-              </w:rPr>
-              <w:t>20</w:t>
+            <w:tcW w:type="dxa" w:w="1080"/>
+          </w:tcPr>
+          <w:p>
+            <w:r>
+              <w:rPr>
+                <w:sz w:val="17"/>
+              </w:rPr>
+              <w:t>0.003 *</w:t>
             </w:r>
           </w:p>
         </w:tc>
@@ -3776,7 +3869,7 @@
       <w:tr>
         <w:tc>
           <w:tcPr>
-            <w:tcW w:type="dxa" w:w="1234"/>
+            <w:tcW w:type="dxa" w:w="1080"/>
           </w:tcPr>
           <w:p>
             <w:r>
@@ -3789,7 +3882,7 @@
         </w:tc>
         <w:tc>
           <w:tcPr>
-            <w:tcW w:type="dxa" w:w="1234"/>
+            <w:tcW w:type="dxa" w:w="1080"/>
           </w:tcPr>
           <w:p>
             <w:r>
@@ -3802,7 +3895,20 @@
         </w:tc>
         <w:tc>
           <w:tcPr>
-            <w:tcW w:type="dxa" w:w="1234"/>
+            <w:tcW w:type="dxa" w:w="1080"/>
+          </w:tcPr>
+          <w:p>
+            <w:r>
+              <w:rPr>
+                <w:sz w:val="17"/>
+              </w:rPr>
+              <w:t>5.20 ± 3.55</w:t>
+            </w:r>
+          </w:p>
+        </w:tc>
+        <w:tc>
+          <w:tcPr>
+            <w:tcW w:type="dxa" w:w="1080"/>
           </w:tcPr>
           <w:p>
             <w:r>
@@ -3815,7 +3921,7 @@
         </w:tc>
         <w:tc>
           <w:tcPr>
-            <w:tcW w:type="dxa" w:w="1234"/>
+            <w:tcW w:type="dxa" w:w="1080"/>
           </w:tcPr>
           <w:p>
             <w:r>
@@ -3828,7 +3934,7 @@
         </w:tc>
         <w:tc>
           <w:tcPr>
-            <w:tcW w:type="dxa" w:w="1234"/>
+            <w:tcW w:type="dxa" w:w="1080"/>
           </w:tcPr>
           <w:p>
             <w:r>
@@ -3841,7 +3947,7 @@
         </w:tc>
         <w:tc>
           <w:tcPr>
-            <w:tcW w:type="dxa" w:w="1234"/>
+            <w:tcW w:type="dxa" w:w="1080"/>
           </w:tcPr>
           <w:p>
             <w:r>
@@ -3854,14 +3960,14 @@
         </w:tc>
         <w:tc>
           <w:tcPr>
-            <w:tcW w:type="dxa" w:w="1234"/>
-          </w:tcPr>
-          <w:p>
-            <w:r>
-              <w:rPr>
-                <w:sz w:val="17"/>
-              </w:rPr>
-              <w:t>16</w:t>
+            <w:tcW w:type="dxa" w:w="1080"/>
+          </w:tcPr>
+          <w:p>
+            <w:r>
+              <w:rPr>
+                <w:sz w:val="17"/>
+              </w:rPr>
+              <w:t>0.174</w:t>
             </w:r>
           </w:p>
         </w:tc>
@@ -3874,7 +3980,7 @@
           <w:b/>
           <w:sz w:val="19"/>
         </w:rPr>
-        <w:t>Tabela 7 — Fadiga BRUMS (0–20): pré vs pós por dia</w:t>
+        <w:t>Tabela 7 — Fadiga BRUMS (0–20): pré → mid → pós por dia</w:t>
       </w:r>
     </w:p>
     <w:tbl>
@@ -3885,18 +3991,19 @@
         <w:tblLook w:firstColumn="1" w:firstRow="1" w:lastColumn="0" w:lastRow="0" w:noHBand="0" w:noVBand="1" w:val="04A0"/>
       </w:tblPr>
       <w:tblGrid>
-        <w:gridCol w:w="1234"/>
-        <w:gridCol w:w="1234"/>
-        <w:gridCol w:w="1234"/>
-        <w:gridCol w:w="1234"/>
-        <w:gridCol w:w="1234"/>
-        <w:gridCol w:w="1234"/>
-        <w:gridCol w:w="1234"/>
+        <w:gridCol w:w="1080"/>
+        <w:gridCol w:w="1080"/>
+        <w:gridCol w:w="1080"/>
+        <w:gridCol w:w="1080"/>
+        <w:gridCol w:w="1080"/>
+        <w:gridCol w:w="1080"/>
+        <w:gridCol w:w="1080"/>
+        <w:gridCol w:w="1080"/>
       </w:tblGrid>
       <w:tr>
         <w:tc>
           <w:tcPr>
-            <w:tcW w:type="dxa" w:w="1234"/>
+            <w:tcW w:type="dxa" w:w="1080"/>
           </w:tcPr>
           <w:p>
             <w:r>
@@ -3910,7 +4017,7 @@
         </w:tc>
         <w:tc>
           <w:tcPr>
-            <w:tcW w:type="dxa" w:w="1234"/>
+            <w:tcW w:type="dxa" w:w="1080"/>
           </w:tcPr>
           <w:p>
             <w:r>
@@ -3924,7 +4031,7 @@
         </w:tc>
         <w:tc>
           <w:tcPr>
-            <w:tcW w:type="dxa" w:w="1234"/>
+            <w:tcW w:type="dxa" w:w="1080"/>
           </w:tcPr>
           <w:p>
             <w:r>
@@ -3932,13 +4039,27 @@
                 <w:b/>
                 <w:sz w:val="17"/>
               </w:rPr>
+              <w:t>Mid (m ± DP)</w:t>
+            </w:r>
+          </w:p>
+        </w:tc>
+        <w:tc>
+          <w:tcPr>
+            <w:tcW w:type="dxa" w:w="1080"/>
+          </w:tcPr>
+          <w:p>
+            <w:r>
+              <w:rPr>
+                <w:b/>
+                <w:sz w:val="17"/>
+              </w:rPr>
               <w:t>Pós (m ± DP)</w:t>
             </w:r>
           </w:p>
         </w:tc>
         <w:tc>
           <w:tcPr>
-            <w:tcW w:type="dxa" w:w="1234"/>
+            <w:tcW w:type="dxa" w:w="1080"/>
           </w:tcPr>
           <w:p>
             <w:r>
@@ -3952,7 +4073,7 @@
         </w:tc>
         <w:tc>
           <w:tcPr>
-            <w:tcW w:type="dxa" w:w="1234"/>
+            <w:tcW w:type="dxa" w:w="1080"/>
           </w:tcPr>
           <w:p>
             <w:r>
@@ -3966,7 +4087,7 @@
         </w:tc>
         <w:tc>
           <w:tcPr>
-            <w:tcW w:type="dxa" w:w="1234"/>
+            <w:tcW w:type="dxa" w:w="1080"/>
           </w:tcPr>
           <w:p>
             <w:r>
@@ -3974,13 +4095,13 @@
                 <w:b/>
                 <w:sz w:val="17"/>
               </w:rPr>
-              <w:t>p (Wilcoxon)</w:t>
-            </w:r>
-          </w:p>
-        </w:tc>
-        <w:tc>
-          <w:tcPr>
-            <w:tcW w:type="dxa" w:w="1234"/>
+              <w:t>p pré×pós</w:t>
+            </w:r>
+          </w:p>
+        </w:tc>
+        <w:tc>
+          <w:tcPr>
+            <w:tcW w:type="dxa" w:w="1080"/>
           </w:tcPr>
           <w:p>
             <w:r>
@@ -3988,7 +4109,7 @@
                 <w:b/>
                 <w:sz w:val="17"/>
               </w:rPr>
-              <w:t>n pares</w:t>
+              <w:t>p Friedman</w:t>
             </w:r>
           </w:p>
         </w:tc>
@@ -3996,7 +4117,7 @@
       <w:tr>
         <w:tc>
           <w:tcPr>
-            <w:tcW w:type="dxa" w:w="1234"/>
+            <w:tcW w:type="dxa" w:w="1080"/>
           </w:tcPr>
           <w:p>
             <w:r>
@@ -4009,7 +4130,7 @@
         </w:tc>
         <w:tc>
           <w:tcPr>
-            <w:tcW w:type="dxa" w:w="1234"/>
+            <w:tcW w:type="dxa" w:w="1080"/>
           </w:tcPr>
           <w:p>
             <w:r>
@@ -4022,7 +4143,20 @@
         </w:tc>
         <w:tc>
           <w:tcPr>
-            <w:tcW w:type="dxa" w:w="1234"/>
+            <w:tcW w:type="dxa" w:w="1080"/>
+          </w:tcPr>
+          <w:p>
+            <w:r>
+              <w:rPr>
+                <w:sz w:val="17"/>
+              </w:rPr>
+              <w:t>—</w:t>
+            </w:r>
+          </w:p>
+        </w:tc>
+        <w:tc>
+          <w:tcPr>
+            <w:tcW w:type="dxa" w:w="1080"/>
           </w:tcPr>
           <w:p>
             <w:r>
@@ -4035,7 +4169,7 @@
         </w:tc>
         <w:tc>
           <w:tcPr>
-            <w:tcW w:type="dxa" w:w="1234"/>
+            <w:tcW w:type="dxa" w:w="1080"/>
           </w:tcPr>
           <w:p>
             <w:r>
@@ -4048,7 +4182,7 @@
         </w:tc>
         <w:tc>
           <w:tcPr>
-            <w:tcW w:type="dxa" w:w="1234"/>
+            <w:tcW w:type="dxa" w:w="1080"/>
           </w:tcPr>
           <w:p>
             <w:r>
@@ -4061,7 +4195,7 @@
         </w:tc>
         <w:tc>
           <w:tcPr>
-            <w:tcW w:type="dxa" w:w="1234"/>
+            <w:tcW w:type="dxa" w:w="1080"/>
           </w:tcPr>
           <w:p>
             <w:r>
@@ -4074,14 +4208,14 @@
         </w:tc>
         <w:tc>
           <w:tcPr>
-            <w:tcW w:type="dxa" w:w="1234"/>
-          </w:tcPr>
-          <w:p>
-            <w:r>
-              <w:rPr>
-                <w:sz w:val="17"/>
-              </w:rPr>
-              <w:t>15</w:t>
+            <w:tcW w:type="dxa" w:w="1080"/>
+          </w:tcPr>
+          <w:p>
+            <w:r>
+              <w:rPr>
+                <w:sz w:val="17"/>
+              </w:rPr>
+              <w:t>—</w:t>
             </w:r>
           </w:p>
         </w:tc>
@@ -4089,7 +4223,7 @@
       <w:tr>
         <w:tc>
           <w:tcPr>
-            <w:tcW w:type="dxa" w:w="1234"/>
+            <w:tcW w:type="dxa" w:w="1080"/>
           </w:tcPr>
           <w:p>
             <w:r>
@@ -4102,7 +4236,7 @@
         </w:tc>
         <w:tc>
           <w:tcPr>
-            <w:tcW w:type="dxa" w:w="1234"/>
+            <w:tcW w:type="dxa" w:w="1080"/>
           </w:tcPr>
           <w:p>
             <w:r>
@@ -4115,7 +4249,20 @@
         </w:tc>
         <w:tc>
           <w:tcPr>
-            <w:tcW w:type="dxa" w:w="1234"/>
+            <w:tcW w:type="dxa" w:w="1080"/>
+          </w:tcPr>
+          <w:p>
+            <w:r>
+              <w:rPr>
+                <w:sz w:val="17"/>
+              </w:rPr>
+              <w:t>5.28 ± 3.19</w:t>
+            </w:r>
+          </w:p>
+        </w:tc>
+        <w:tc>
+          <w:tcPr>
+            <w:tcW w:type="dxa" w:w="1080"/>
           </w:tcPr>
           <w:p>
             <w:r>
@@ -4128,7 +4275,7 @@
         </w:tc>
         <w:tc>
           <w:tcPr>
-            <w:tcW w:type="dxa" w:w="1234"/>
+            <w:tcW w:type="dxa" w:w="1080"/>
           </w:tcPr>
           <w:p>
             <w:r>
@@ -4141,7 +4288,7 @@
         </w:tc>
         <w:tc>
           <w:tcPr>
-            <w:tcW w:type="dxa" w:w="1234"/>
+            <w:tcW w:type="dxa" w:w="1080"/>
           </w:tcPr>
           <w:p>
             <w:r>
@@ -4154,7 +4301,7 @@
         </w:tc>
         <w:tc>
           <w:tcPr>
-            <w:tcW w:type="dxa" w:w="1234"/>
+            <w:tcW w:type="dxa" w:w="1080"/>
           </w:tcPr>
           <w:p>
             <w:r>
@@ -4167,14 +4314,14 @@
         </w:tc>
         <w:tc>
           <w:tcPr>
-            <w:tcW w:type="dxa" w:w="1234"/>
-          </w:tcPr>
-          <w:p>
-            <w:r>
-              <w:rPr>
-                <w:sz w:val="17"/>
-              </w:rPr>
-              <w:t>26</w:t>
+            <w:tcW w:type="dxa" w:w="1080"/>
+          </w:tcPr>
+          <w:p>
+            <w:r>
+              <w:rPr>
+                <w:sz w:val="17"/>
+              </w:rPr>
+              <w:t>0.053</w:t>
             </w:r>
           </w:p>
         </w:tc>
@@ -4182,7 +4329,7 @@
       <w:tr>
         <w:tc>
           <w:tcPr>
-            <w:tcW w:type="dxa" w:w="1234"/>
+            <w:tcW w:type="dxa" w:w="1080"/>
           </w:tcPr>
           <w:p>
             <w:r>
@@ -4195,7 +4342,7 @@
         </w:tc>
         <w:tc>
           <w:tcPr>
-            <w:tcW w:type="dxa" w:w="1234"/>
+            <w:tcW w:type="dxa" w:w="1080"/>
           </w:tcPr>
           <w:p>
             <w:r>
@@ -4208,7 +4355,20 @@
         </w:tc>
         <w:tc>
           <w:tcPr>
-            <w:tcW w:type="dxa" w:w="1234"/>
+            <w:tcW w:type="dxa" w:w="1080"/>
+          </w:tcPr>
+          <w:p>
+            <w:r>
+              <w:rPr>
+                <w:sz w:val="17"/>
+              </w:rPr>
+              <w:t>6.25 ± 3.01</w:t>
+            </w:r>
+          </w:p>
+        </w:tc>
+        <w:tc>
+          <w:tcPr>
+            <w:tcW w:type="dxa" w:w="1080"/>
           </w:tcPr>
           <w:p>
             <w:r>
@@ -4221,7 +4381,7 @@
         </w:tc>
         <w:tc>
           <w:tcPr>
-            <w:tcW w:type="dxa" w:w="1234"/>
+            <w:tcW w:type="dxa" w:w="1080"/>
           </w:tcPr>
           <w:p>
             <w:r>
@@ -4234,7 +4394,7 @@
         </w:tc>
         <w:tc>
           <w:tcPr>
-            <w:tcW w:type="dxa" w:w="1234"/>
+            <w:tcW w:type="dxa" w:w="1080"/>
           </w:tcPr>
           <w:p>
             <w:r>
@@ -4247,7 +4407,7 @@
         </w:tc>
         <w:tc>
           <w:tcPr>
-            <w:tcW w:type="dxa" w:w="1234"/>
+            <w:tcW w:type="dxa" w:w="1080"/>
           </w:tcPr>
           <w:p>
             <w:r>
@@ -4260,14 +4420,14 @@
         </w:tc>
         <w:tc>
           <w:tcPr>
-            <w:tcW w:type="dxa" w:w="1234"/>
-          </w:tcPr>
-          <w:p>
-            <w:r>
-              <w:rPr>
-                <w:sz w:val="17"/>
-              </w:rPr>
-              <w:t>21</w:t>
+            <w:tcW w:type="dxa" w:w="1080"/>
+          </w:tcPr>
+          <w:p>
+            <w:r>
+              <w:rPr>
+                <w:sz w:val="17"/>
+              </w:rPr>
+              <w:t>0.408</w:t>
             </w:r>
           </w:p>
         </w:tc>
@@ -4275,7 +4435,7 @@
       <w:tr>
         <w:tc>
           <w:tcPr>
-            <w:tcW w:type="dxa" w:w="1234"/>
+            <w:tcW w:type="dxa" w:w="1080"/>
           </w:tcPr>
           <w:p>
             <w:r>
@@ -4288,7 +4448,7 @@
         </w:tc>
         <w:tc>
           <w:tcPr>
-            <w:tcW w:type="dxa" w:w="1234"/>
+            <w:tcW w:type="dxa" w:w="1080"/>
           </w:tcPr>
           <w:p>
             <w:r>
@@ -4301,7 +4461,20 @@
         </w:tc>
         <w:tc>
           <w:tcPr>
-            <w:tcW w:type="dxa" w:w="1234"/>
+            <w:tcW w:type="dxa" w:w="1080"/>
+          </w:tcPr>
+          <w:p>
+            <w:r>
+              <w:rPr>
+                <w:sz w:val="17"/>
+              </w:rPr>
+              <w:t>7.04 ± 4.32</w:t>
+            </w:r>
+          </w:p>
+        </w:tc>
+        <w:tc>
+          <w:tcPr>
+            <w:tcW w:type="dxa" w:w="1080"/>
           </w:tcPr>
           <w:p>
             <w:r>
@@ -4314,7 +4487,7 @@
         </w:tc>
         <w:tc>
           <w:tcPr>
-            <w:tcW w:type="dxa" w:w="1234"/>
+            <w:tcW w:type="dxa" w:w="1080"/>
           </w:tcPr>
           <w:p>
             <w:r>
@@ -4327,7 +4500,7 @@
         </w:tc>
         <w:tc>
           <w:tcPr>
-            <w:tcW w:type="dxa" w:w="1234"/>
+            <w:tcW w:type="dxa" w:w="1080"/>
           </w:tcPr>
           <w:p>
             <w:r>
@@ -4340,7 +4513,7 @@
         </w:tc>
         <w:tc>
           <w:tcPr>
-            <w:tcW w:type="dxa" w:w="1234"/>
+            <w:tcW w:type="dxa" w:w="1080"/>
           </w:tcPr>
           <w:p>
             <w:r>
@@ -4353,14 +4526,14 @@
         </w:tc>
         <w:tc>
           <w:tcPr>
-            <w:tcW w:type="dxa" w:w="1234"/>
-          </w:tcPr>
-          <w:p>
-            <w:r>
-              <w:rPr>
-                <w:sz w:val="17"/>
-              </w:rPr>
-              <w:t>18</w:t>
+            <w:tcW w:type="dxa" w:w="1080"/>
+          </w:tcPr>
+          <w:p>
+            <w:r>
+              <w:rPr>
+                <w:sz w:val="17"/>
+              </w:rPr>
+              <w:t>0.538</w:t>
             </w:r>
           </w:p>
         </w:tc>
@@ -4368,7 +4541,7 @@
       <w:tr>
         <w:tc>
           <w:tcPr>
-            <w:tcW w:type="dxa" w:w="1234"/>
+            <w:tcW w:type="dxa" w:w="1080"/>
           </w:tcPr>
           <w:p>
             <w:r>
@@ -4381,7 +4554,7 @@
         </w:tc>
         <w:tc>
           <w:tcPr>
-            <w:tcW w:type="dxa" w:w="1234"/>
+            <w:tcW w:type="dxa" w:w="1080"/>
           </w:tcPr>
           <w:p>
             <w:r>
@@ -4394,7 +4567,20 @@
         </w:tc>
         <w:tc>
           <w:tcPr>
-            <w:tcW w:type="dxa" w:w="1234"/>
+            <w:tcW w:type="dxa" w:w="1080"/>
+          </w:tcPr>
+          <w:p>
+            <w:r>
+              <w:rPr>
+                <w:sz w:val="17"/>
+              </w:rPr>
+              <w:t>5.49 ± 2.75</w:t>
+            </w:r>
+          </w:p>
+        </w:tc>
+        <w:tc>
+          <w:tcPr>
+            <w:tcW w:type="dxa" w:w="1080"/>
           </w:tcPr>
           <w:p>
             <w:r>
@@ -4407,7 +4593,7 @@
         </w:tc>
         <w:tc>
           <w:tcPr>
-            <w:tcW w:type="dxa" w:w="1234"/>
+            <w:tcW w:type="dxa" w:w="1080"/>
           </w:tcPr>
           <w:p>
             <w:r>
@@ -4420,7 +4606,7 @@
         </w:tc>
         <w:tc>
           <w:tcPr>
-            <w:tcW w:type="dxa" w:w="1234"/>
+            <w:tcW w:type="dxa" w:w="1080"/>
           </w:tcPr>
           <w:p>
             <w:r>
@@ -4433,7 +4619,7 @@
         </w:tc>
         <w:tc>
           <w:tcPr>
-            <w:tcW w:type="dxa" w:w="1234"/>
+            <w:tcW w:type="dxa" w:w="1080"/>
           </w:tcPr>
           <w:p>
             <w:r>
@@ -4446,14 +4632,14 @@
         </w:tc>
         <w:tc>
           <w:tcPr>
-            <w:tcW w:type="dxa" w:w="1234"/>
-          </w:tcPr>
-          <w:p>
-            <w:r>
-              <w:rPr>
-                <w:sz w:val="17"/>
-              </w:rPr>
-              <w:t>19</w:t>
+            <w:tcW w:type="dxa" w:w="1080"/>
+          </w:tcPr>
+          <w:p>
+            <w:r>
+              <w:rPr>
+                <w:sz w:val="17"/>
+              </w:rPr>
+              <w:t>0.549</w:t>
             </w:r>
           </w:p>
         </w:tc>
@@ -4461,7 +4647,7 @@
       <w:tr>
         <w:tc>
           <w:tcPr>
-            <w:tcW w:type="dxa" w:w="1234"/>
+            <w:tcW w:type="dxa" w:w="1080"/>
           </w:tcPr>
           <w:p>
             <w:r>
@@ -4474,7 +4660,7 @@
         </w:tc>
         <w:tc>
           <w:tcPr>
-            <w:tcW w:type="dxa" w:w="1234"/>
+            <w:tcW w:type="dxa" w:w="1080"/>
           </w:tcPr>
           <w:p>
             <w:r>
@@ -4487,7 +4673,20 @@
         </w:tc>
         <w:tc>
           <w:tcPr>
-            <w:tcW w:type="dxa" w:w="1234"/>
+            <w:tcW w:type="dxa" w:w="1080"/>
+          </w:tcPr>
+          <w:p>
+            <w:r>
+              <w:rPr>
+                <w:sz w:val="17"/>
+              </w:rPr>
+              <w:t>6.44 ± 3.86</w:t>
+            </w:r>
+          </w:p>
+        </w:tc>
+        <w:tc>
+          <w:tcPr>
+            <w:tcW w:type="dxa" w:w="1080"/>
           </w:tcPr>
           <w:p>
             <w:r>
@@ -4500,7 +4699,7 @@
         </w:tc>
         <w:tc>
           <w:tcPr>
-            <w:tcW w:type="dxa" w:w="1234"/>
+            <w:tcW w:type="dxa" w:w="1080"/>
           </w:tcPr>
           <w:p>
             <w:r>
@@ -4513,7 +4712,7 @@
         </w:tc>
         <w:tc>
           <w:tcPr>
-            <w:tcW w:type="dxa" w:w="1234"/>
+            <w:tcW w:type="dxa" w:w="1080"/>
           </w:tcPr>
           <w:p>
             <w:r>
@@ -4526,7 +4725,7 @@
         </w:tc>
         <w:tc>
           <w:tcPr>
-            <w:tcW w:type="dxa" w:w="1234"/>
+            <w:tcW w:type="dxa" w:w="1080"/>
           </w:tcPr>
           <w:p>
             <w:r>
@@ -4539,14 +4738,14 @@
         </w:tc>
         <w:tc>
           <w:tcPr>
-            <w:tcW w:type="dxa" w:w="1234"/>
-          </w:tcPr>
-          <w:p>
-            <w:r>
-              <w:rPr>
-                <w:sz w:val="17"/>
-              </w:rPr>
-              <w:t>20</w:t>
+            <w:tcW w:type="dxa" w:w="1080"/>
+          </w:tcPr>
+          <w:p>
+            <w:r>
+              <w:rPr>
+                <w:sz w:val="17"/>
+              </w:rPr>
+              <w:t>0.360</w:t>
             </w:r>
           </w:p>
         </w:tc>
@@ -4554,7 +4753,7 @@
       <w:tr>
         <w:tc>
           <w:tcPr>
-            <w:tcW w:type="dxa" w:w="1234"/>
+            <w:tcW w:type="dxa" w:w="1080"/>
           </w:tcPr>
           <w:p>
             <w:r>
@@ -4567,7 +4766,7 @@
         </w:tc>
         <w:tc>
           <w:tcPr>
-            <w:tcW w:type="dxa" w:w="1234"/>
+            <w:tcW w:type="dxa" w:w="1080"/>
           </w:tcPr>
           <w:p>
             <w:r>
@@ -4580,7 +4779,20 @@
         </w:tc>
         <w:tc>
           <w:tcPr>
-            <w:tcW w:type="dxa" w:w="1234"/>
+            <w:tcW w:type="dxa" w:w="1080"/>
+          </w:tcPr>
+          <w:p>
+            <w:r>
+              <w:rPr>
+                <w:sz w:val="17"/>
+              </w:rPr>
+              <w:t>8.60 ± 2.33</w:t>
+            </w:r>
+          </w:p>
+        </w:tc>
+        <w:tc>
+          <w:tcPr>
+            <w:tcW w:type="dxa" w:w="1080"/>
           </w:tcPr>
           <w:p>
             <w:r>
@@ -4593,7 +4805,7 @@
         </w:tc>
         <w:tc>
           <w:tcPr>
-            <w:tcW w:type="dxa" w:w="1234"/>
+            <w:tcW w:type="dxa" w:w="1080"/>
           </w:tcPr>
           <w:p>
             <w:r>
@@ -4606,7 +4818,7 @@
         </w:tc>
         <w:tc>
           <w:tcPr>
-            <w:tcW w:type="dxa" w:w="1234"/>
+            <w:tcW w:type="dxa" w:w="1080"/>
           </w:tcPr>
           <w:p>
             <w:r>
@@ -4619,7 +4831,7 @@
         </w:tc>
         <w:tc>
           <w:tcPr>
-            <w:tcW w:type="dxa" w:w="1234"/>
+            <w:tcW w:type="dxa" w:w="1080"/>
           </w:tcPr>
           <w:p>
             <w:r>
@@ -4632,14 +4844,14 @@
         </w:tc>
         <w:tc>
           <w:tcPr>
-            <w:tcW w:type="dxa" w:w="1234"/>
-          </w:tcPr>
-          <w:p>
-            <w:r>
-              <w:rPr>
-                <w:sz w:val="17"/>
-              </w:rPr>
-              <w:t>16</w:t>
+            <w:tcW w:type="dxa" w:w="1080"/>
+          </w:tcPr>
+          <w:p>
+            <w:r>
+              <w:rPr>
+                <w:sz w:val="17"/>
+              </w:rPr>
+              <w:t>0.486</w:t>
             </w:r>
           </w:p>
         </w:tc>
@@ -4652,7 +4864,7 @@
           <w:b/>
           <w:sz w:val="19"/>
         </w:rPr>
-        <w:t>Tabela 8 — PTH/TMD: pré vs pós por dia</w:t>
+        <w:t>Tabela 8 — PTH/TMD: pré → mid → pós por dia</w:t>
       </w:r>
     </w:p>
     <w:tbl>
@@ -4663,18 +4875,19 @@
         <w:tblLook w:firstColumn="1" w:firstRow="1" w:lastColumn="0" w:lastRow="0" w:noHBand="0" w:noVBand="1" w:val="04A0"/>
       </w:tblPr>
       <w:tblGrid>
-        <w:gridCol w:w="1234"/>
-        <w:gridCol w:w="1234"/>
-        <w:gridCol w:w="1234"/>
-        <w:gridCol w:w="1234"/>
-        <w:gridCol w:w="1234"/>
-        <w:gridCol w:w="1234"/>
-        <w:gridCol w:w="1234"/>
+        <w:gridCol w:w="1080"/>
+        <w:gridCol w:w="1080"/>
+        <w:gridCol w:w="1080"/>
+        <w:gridCol w:w="1080"/>
+        <w:gridCol w:w="1080"/>
+        <w:gridCol w:w="1080"/>
+        <w:gridCol w:w="1080"/>
+        <w:gridCol w:w="1080"/>
       </w:tblGrid>
       <w:tr>
         <w:tc>
           <w:tcPr>
-            <w:tcW w:type="dxa" w:w="1234"/>
+            <w:tcW w:type="dxa" w:w="1080"/>
           </w:tcPr>
           <w:p>
             <w:r>
@@ -4688,7 +4901,7 @@
         </w:tc>
         <w:tc>
           <w:tcPr>
-            <w:tcW w:type="dxa" w:w="1234"/>
+            <w:tcW w:type="dxa" w:w="1080"/>
           </w:tcPr>
           <w:p>
             <w:r>
@@ -4702,7 +4915,7 @@
         </w:tc>
         <w:tc>
           <w:tcPr>
-            <w:tcW w:type="dxa" w:w="1234"/>
+            <w:tcW w:type="dxa" w:w="1080"/>
           </w:tcPr>
           <w:p>
             <w:r>
@@ -4710,13 +4923,27 @@
                 <w:b/>
                 <w:sz w:val="17"/>
               </w:rPr>
+              <w:t>Mid (m ± DP)</w:t>
+            </w:r>
+          </w:p>
+        </w:tc>
+        <w:tc>
+          <w:tcPr>
+            <w:tcW w:type="dxa" w:w="1080"/>
+          </w:tcPr>
+          <w:p>
+            <w:r>
+              <w:rPr>
+                <w:b/>
+                <w:sz w:val="17"/>
+              </w:rPr>
               <w:t>Pós (m ± DP)</w:t>
             </w:r>
           </w:p>
         </w:tc>
         <w:tc>
           <w:tcPr>
-            <w:tcW w:type="dxa" w:w="1234"/>
+            <w:tcW w:type="dxa" w:w="1080"/>
           </w:tcPr>
           <w:p>
             <w:r>
@@ -4730,7 +4957,7 @@
         </w:tc>
         <w:tc>
           <w:tcPr>
-            <w:tcW w:type="dxa" w:w="1234"/>
+            <w:tcW w:type="dxa" w:w="1080"/>
           </w:tcPr>
           <w:p>
             <w:r>
@@ -4744,7 +4971,7 @@
         </w:tc>
         <w:tc>
           <w:tcPr>
-            <w:tcW w:type="dxa" w:w="1234"/>
+            <w:tcW w:type="dxa" w:w="1080"/>
           </w:tcPr>
           <w:p>
             <w:r>
@@ -4752,13 +4979,13 @@
                 <w:b/>
                 <w:sz w:val="17"/>
               </w:rPr>
-              <w:t>p (Wilcoxon)</w:t>
-            </w:r>
-          </w:p>
-        </w:tc>
-        <w:tc>
-          <w:tcPr>
-            <w:tcW w:type="dxa" w:w="1234"/>
+              <w:t>p pré×pós</w:t>
+            </w:r>
+          </w:p>
+        </w:tc>
+        <w:tc>
+          <w:tcPr>
+            <w:tcW w:type="dxa" w:w="1080"/>
           </w:tcPr>
           <w:p>
             <w:r>
@@ -4766,7 +4993,7 @@
                 <w:b/>
                 <w:sz w:val="17"/>
               </w:rPr>
-              <w:t>n pares</w:t>
+              <w:t>p Friedman</w:t>
             </w:r>
           </w:p>
         </w:tc>
@@ -4774,7 +5001,7 @@
       <w:tr>
         <w:tc>
           <w:tcPr>
-            <w:tcW w:type="dxa" w:w="1234"/>
+            <w:tcW w:type="dxa" w:w="1080"/>
           </w:tcPr>
           <w:p>
             <w:r>
@@ -4787,7 +5014,7 @@
         </w:tc>
         <w:tc>
           <w:tcPr>
-            <w:tcW w:type="dxa" w:w="1234"/>
+            <w:tcW w:type="dxa" w:w="1080"/>
           </w:tcPr>
           <w:p>
             <w:r>
@@ -4800,7 +5027,20 @@
         </w:tc>
         <w:tc>
           <w:tcPr>
-            <w:tcW w:type="dxa" w:w="1234"/>
+            <w:tcW w:type="dxa" w:w="1080"/>
+          </w:tcPr>
+          <w:p>
+            <w:r>
+              <w:rPr>
+                <w:sz w:val="17"/>
+              </w:rPr>
+              <w:t>—</w:t>
+            </w:r>
+          </w:p>
+        </w:tc>
+        <w:tc>
+          <w:tcPr>
+            <w:tcW w:type="dxa" w:w="1080"/>
           </w:tcPr>
           <w:p>
             <w:r>
@@ -4813,7 +5053,7 @@
         </w:tc>
         <w:tc>
           <w:tcPr>
-            <w:tcW w:type="dxa" w:w="1234"/>
+            <w:tcW w:type="dxa" w:w="1080"/>
           </w:tcPr>
           <w:p>
             <w:r>
@@ -4826,7 +5066,7 @@
         </w:tc>
         <w:tc>
           <w:tcPr>
-            <w:tcW w:type="dxa" w:w="1234"/>
+            <w:tcW w:type="dxa" w:w="1080"/>
           </w:tcPr>
           <w:p>
             <w:r>
@@ -4839,7 +5079,7 @@
         </w:tc>
         <w:tc>
           <w:tcPr>
-            <w:tcW w:type="dxa" w:w="1234"/>
+            <w:tcW w:type="dxa" w:w="1080"/>
           </w:tcPr>
           <w:p>
             <w:r>
@@ -4852,14 +5092,14 @@
         </w:tc>
         <w:tc>
           <w:tcPr>
-            <w:tcW w:type="dxa" w:w="1234"/>
-          </w:tcPr>
-          <w:p>
-            <w:r>
-              <w:rPr>
-                <w:sz w:val="17"/>
-              </w:rPr>
-              <w:t>15</w:t>
+            <w:tcW w:type="dxa" w:w="1080"/>
+          </w:tcPr>
+          <w:p>
+            <w:r>
+              <w:rPr>
+                <w:sz w:val="17"/>
+              </w:rPr>
+              <w:t>—</w:t>
             </w:r>
           </w:p>
         </w:tc>
@@ -4867,7 +5107,7 @@
       <w:tr>
         <w:tc>
           <w:tcPr>
-            <w:tcW w:type="dxa" w:w="1234"/>
+            <w:tcW w:type="dxa" w:w="1080"/>
           </w:tcPr>
           <w:p>
             <w:r>
@@ -4880,7 +5120,7 @@
         </w:tc>
         <w:tc>
           <w:tcPr>
-            <w:tcW w:type="dxa" w:w="1234"/>
+            <w:tcW w:type="dxa" w:w="1080"/>
           </w:tcPr>
           <w:p>
             <w:r>
@@ -4893,7 +5133,20 @@
         </w:tc>
         <w:tc>
           <w:tcPr>
-            <w:tcW w:type="dxa" w:w="1234"/>
+            <w:tcW w:type="dxa" w:w="1080"/>
+          </w:tcPr>
+          <w:p>
+            <w:r>
+              <w:rPr>
+                <w:sz w:val="17"/>
+              </w:rPr>
+              <w:t>4.71 ± 8.51</w:t>
+            </w:r>
+          </w:p>
+        </w:tc>
+        <w:tc>
+          <w:tcPr>
+            <w:tcW w:type="dxa" w:w="1080"/>
           </w:tcPr>
           <w:p>
             <w:r>
@@ -4906,7 +5159,7 @@
         </w:tc>
         <w:tc>
           <w:tcPr>
-            <w:tcW w:type="dxa" w:w="1234"/>
+            <w:tcW w:type="dxa" w:w="1080"/>
           </w:tcPr>
           <w:p>
             <w:r>
@@ -4919,7 +5172,7 @@
         </w:tc>
         <w:tc>
           <w:tcPr>
-            <w:tcW w:type="dxa" w:w="1234"/>
+            <w:tcW w:type="dxa" w:w="1080"/>
           </w:tcPr>
           <w:p>
             <w:r>
@@ -4932,7 +5185,7 @@
         </w:tc>
         <w:tc>
           <w:tcPr>
-            <w:tcW w:type="dxa" w:w="1234"/>
+            <w:tcW w:type="dxa" w:w="1080"/>
           </w:tcPr>
           <w:p>
             <w:r>
@@ -4945,14 +5198,14 @@
         </w:tc>
         <w:tc>
           <w:tcPr>
-            <w:tcW w:type="dxa" w:w="1234"/>
-          </w:tcPr>
-          <w:p>
-            <w:r>
-              <w:rPr>
-                <w:sz w:val="17"/>
-              </w:rPr>
-              <w:t>26</w:t>
+            <w:tcW w:type="dxa" w:w="1080"/>
+          </w:tcPr>
+          <w:p>
+            <w:r>
+              <w:rPr>
+                <w:sz w:val="17"/>
+              </w:rPr>
+              <w:t>0.252</w:t>
             </w:r>
           </w:p>
         </w:tc>
@@ -4960,7 +5213,7 @@
       <w:tr>
         <w:tc>
           <w:tcPr>
-            <w:tcW w:type="dxa" w:w="1234"/>
+            <w:tcW w:type="dxa" w:w="1080"/>
           </w:tcPr>
           <w:p>
             <w:r>
@@ -4973,7 +5226,7 @@
         </w:tc>
         <w:tc>
           <w:tcPr>
-            <w:tcW w:type="dxa" w:w="1234"/>
+            <w:tcW w:type="dxa" w:w="1080"/>
           </w:tcPr>
           <w:p>
             <w:r>
@@ -4986,7 +5239,20 @@
         </w:tc>
         <w:tc>
           <w:tcPr>
-            <w:tcW w:type="dxa" w:w="1234"/>
+            <w:tcW w:type="dxa" w:w="1080"/>
+          </w:tcPr>
+          <w:p>
+            <w:r>
+              <w:rPr>
+                <w:sz w:val="17"/>
+              </w:rPr>
+              <w:t>4.58 ± 7.24</w:t>
+            </w:r>
+          </w:p>
+        </w:tc>
+        <w:tc>
+          <w:tcPr>
+            <w:tcW w:type="dxa" w:w="1080"/>
           </w:tcPr>
           <w:p>
             <w:r>
@@ -4999,7 +5265,7 @@
         </w:tc>
         <w:tc>
           <w:tcPr>
-            <w:tcW w:type="dxa" w:w="1234"/>
+            <w:tcW w:type="dxa" w:w="1080"/>
           </w:tcPr>
           <w:p>
             <w:r>
@@ -5012,7 +5278,7 @@
         </w:tc>
         <w:tc>
           <w:tcPr>
-            <w:tcW w:type="dxa" w:w="1234"/>
+            <w:tcW w:type="dxa" w:w="1080"/>
           </w:tcPr>
           <w:p>
             <w:r>
@@ -5025,7 +5291,7 @@
         </w:tc>
         <w:tc>
           <w:tcPr>
-            <w:tcW w:type="dxa" w:w="1234"/>
+            <w:tcW w:type="dxa" w:w="1080"/>
           </w:tcPr>
           <w:p>
             <w:r>
@@ -5038,14 +5304,14 @@
         </w:tc>
         <w:tc>
           <w:tcPr>
-            <w:tcW w:type="dxa" w:w="1234"/>
-          </w:tcPr>
-          <w:p>
-            <w:r>
-              <w:rPr>
-                <w:sz w:val="17"/>
-              </w:rPr>
-              <w:t>21</w:t>
+            <w:tcW w:type="dxa" w:w="1080"/>
+          </w:tcPr>
+          <w:p>
+            <w:r>
+              <w:rPr>
+                <w:sz w:val="17"/>
+              </w:rPr>
+              <w:t>0.399</w:t>
             </w:r>
           </w:p>
         </w:tc>
@@ -5053,7 +5319,7 @@
       <w:tr>
         <w:tc>
           <w:tcPr>
-            <w:tcW w:type="dxa" w:w="1234"/>
+            <w:tcW w:type="dxa" w:w="1080"/>
           </w:tcPr>
           <w:p>
             <w:r>
@@ -5066,7 +5332,7 @@
         </w:tc>
         <w:tc>
           <w:tcPr>
-            <w:tcW w:type="dxa" w:w="1234"/>
+            <w:tcW w:type="dxa" w:w="1080"/>
           </w:tcPr>
           <w:p>
             <w:r>
@@ -5079,7 +5345,20 @@
         </w:tc>
         <w:tc>
           <w:tcPr>
-            <w:tcW w:type="dxa" w:w="1234"/>
+            <w:tcW w:type="dxa" w:w="1080"/>
+          </w:tcPr>
+          <w:p>
+            <w:r>
+              <w:rPr>
+                <w:sz w:val="17"/>
+              </w:rPr>
+              <w:t>7.15 ± 11.09</w:t>
+            </w:r>
+          </w:p>
+        </w:tc>
+        <w:tc>
+          <w:tcPr>
+            <w:tcW w:type="dxa" w:w="1080"/>
           </w:tcPr>
           <w:p>
             <w:r>
@@ -5092,7 +5371,7 @@
         </w:tc>
         <w:tc>
           <w:tcPr>
-            <w:tcW w:type="dxa" w:w="1234"/>
+            <w:tcW w:type="dxa" w:w="1080"/>
           </w:tcPr>
           <w:p>
             <w:r>
@@ -5105,7 +5384,7 @@
         </w:tc>
         <w:tc>
           <w:tcPr>
-            <w:tcW w:type="dxa" w:w="1234"/>
+            <w:tcW w:type="dxa" w:w="1080"/>
           </w:tcPr>
           <w:p>
             <w:r>
@@ -5118,7 +5397,7 @@
         </w:tc>
         <w:tc>
           <w:tcPr>
-            <w:tcW w:type="dxa" w:w="1234"/>
+            <w:tcW w:type="dxa" w:w="1080"/>
           </w:tcPr>
           <w:p>
             <w:r>
@@ -5131,14 +5410,14 @@
         </w:tc>
         <w:tc>
           <w:tcPr>
-            <w:tcW w:type="dxa" w:w="1234"/>
-          </w:tcPr>
-          <w:p>
-            <w:r>
-              <w:rPr>
-                <w:sz w:val="17"/>
-              </w:rPr>
-              <w:t>18</w:t>
+            <w:tcW w:type="dxa" w:w="1080"/>
+          </w:tcPr>
+          <w:p>
+            <w:r>
+              <w:rPr>
+                <w:sz w:val="17"/>
+              </w:rPr>
+              <w:t>0.096</w:t>
             </w:r>
           </w:p>
         </w:tc>
@@ -5146,7 +5425,7 @@
       <w:tr>
         <w:tc>
           <w:tcPr>
-            <w:tcW w:type="dxa" w:w="1234"/>
+            <w:tcW w:type="dxa" w:w="1080"/>
           </w:tcPr>
           <w:p>
             <w:r>
@@ -5159,7 +5438,7 @@
         </w:tc>
         <w:tc>
           <w:tcPr>
-            <w:tcW w:type="dxa" w:w="1234"/>
+            <w:tcW w:type="dxa" w:w="1080"/>
           </w:tcPr>
           <w:p>
             <w:r>
@@ -5172,7 +5451,20 @@
         </w:tc>
         <w:tc>
           <w:tcPr>
-            <w:tcW w:type="dxa" w:w="1234"/>
+            <w:tcW w:type="dxa" w:w="1080"/>
+          </w:tcPr>
+          <w:p>
+            <w:r>
+              <w:rPr>
+                <w:sz w:val="17"/>
+              </w:rPr>
+              <w:t>1.17 ± 4.84</w:t>
+            </w:r>
+          </w:p>
+        </w:tc>
+        <w:tc>
+          <w:tcPr>
+            <w:tcW w:type="dxa" w:w="1080"/>
           </w:tcPr>
           <w:p>
             <w:r>
@@ -5185,7 +5477,7 @@
         </w:tc>
         <w:tc>
           <w:tcPr>
-            <w:tcW w:type="dxa" w:w="1234"/>
+            <w:tcW w:type="dxa" w:w="1080"/>
           </w:tcPr>
           <w:p>
             <w:r>
@@ -5198,7 +5490,7 @@
         </w:tc>
         <w:tc>
           <w:tcPr>
-            <w:tcW w:type="dxa" w:w="1234"/>
+            <w:tcW w:type="dxa" w:w="1080"/>
           </w:tcPr>
           <w:p>
             <w:r>
@@ -5211,7 +5503,7 @@
         </w:tc>
         <w:tc>
           <w:tcPr>
-            <w:tcW w:type="dxa" w:w="1234"/>
+            <w:tcW w:type="dxa" w:w="1080"/>
           </w:tcPr>
           <w:p>
             <w:r>
@@ -5224,14 +5516,14 @@
         </w:tc>
         <w:tc>
           <w:tcPr>
-            <w:tcW w:type="dxa" w:w="1234"/>
-          </w:tcPr>
-          <w:p>
-            <w:r>
-              <w:rPr>
-                <w:sz w:val="17"/>
-              </w:rPr>
-              <w:t>19</w:t>
+            <w:tcW w:type="dxa" w:w="1080"/>
+          </w:tcPr>
+          <w:p>
+            <w:r>
+              <w:rPr>
+                <w:sz w:val="17"/>
+              </w:rPr>
+              <w:t>0.856</w:t>
             </w:r>
           </w:p>
         </w:tc>
@@ -5239,7 +5531,7 @@
       <w:tr>
         <w:tc>
           <w:tcPr>
-            <w:tcW w:type="dxa" w:w="1234"/>
+            <w:tcW w:type="dxa" w:w="1080"/>
           </w:tcPr>
           <w:p>
             <w:r>
@@ -5252,7 +5544,7 @@
         </w:tc>
         <w:tc>
           <w:tcPr>
-            <w:tcW w:type="dxa" w:w="1234"/>
+            <w:tcW w:type="dxa" w:w="1080"/>
           </w:tcPr>
           <w:p>
             <w:r>
@@ -5265,7 +5557,20 @@
         </w:tc>
         <w:tc>
           <w:tcPr>
-            <w:tcW w:type="dxa" w:w="1234"/>
+            <w:tcW w:type="dxa" w:w="1080"/>
+          </w:tcPr>
+          <w:p>
+            <w:r>
+              <w:rPr>
+                <w:sz w:val="17"/>
+              </w:rPr>
+              <w:t>4.49 ± 9.70</w:t>
+            </w:r>
+          </w:p>
+        </w:tc>
+        <w:tc>
+          <w:tcPr>
+            <w:tcW w:type="dxa" w:w="1080"/>
           </w:tcPr>
           <w:p>
             <w:r>
@@ -5278,7 +5583,7 @@
         </w:tc>
         <w:tc>
           <w:tcPr>
-            <w:tcW w:type="dxa" w:w="1234"/>
+            <w:tcW w:type="dxa" w:w="1080"/>
           </w:tcPr>
           <w:p>
             <w:r>
@@ -5291,7 +5596,7 @@
         </w:tc>
         <w:tc>
           <w:tcPr>
-            <w:tcW w:type="dxa" w:w="1234"/>
+            <w:tcW w:type="dxa" w:w="1080"/>
           </w:tcPr>
           <w:p>
             <w:r>
@@ -5304,7 +5609,7 @@
         </w:tc>
         <w:tc>
           <w:tcPr>
-            <w:tcW w:type="dxa" w:w="1234"/>
+            <w:tcW w:type="dxa" w:w="1080"/>
           </w:tcPr>
           <w:p>
             <w:r>
@@ -5317,14 +5622,14 @@
         </w:tc>
         <w:tc>
           <w:tcPr>
-            <w:tcW w:type="dxa" w:w="1234"/>
-          </w:tcPr>
-          <w:p>
-            <w:r>
-              <w:rPr>
-                <w:sz w:val="17"/>
-              </w:rPr>
-              <w:t>20</w:t>
+            <w:tcW w:type="dxa" w:w="1080"/>
+          </w:tcPr>
+          <w:p>
+            <w:r>
+              <w:rPr>
+                <w:sz w:val="17"/>
+              </w:rPr>
+              <w:t>0.006 *</w:t>
             </w:r>
           </w:p>
         </w:tc>
@@ -5332,7 +5637,7 @@
       <w:tr>
         <w:tc>
           <w:tcPr>
-            <w:tcW w:type="dxa" w:w="1234"/>
+            <w:tcW w:type="dxa" w:w="1080"/>
           </w:tcPr>
           <w:p>
             <w:r>
@@ -5345,7 +5650,7 @@
         </w:tc>
         <w:tc>
           <w:tcPr>
-            <w:tcW w:type="dxa" w:w="1234"/>
+            <w:tcW w:type="dxa" w:w="1080"/>
           </w:tcPr>
           <w:p>
             <w:r>
@@ -5358,7 +5663,20 @@
         </w:tc>
         <w:tc>
           <w:tcPr>
-            <w:tcW w:type="dxa" w:w="1234"/>
+            <w:tcW w:type="dxa" w:w="1080"/>
+          </w:tcPr>
+          <w:p>
+            <w:r>
+              <w:rPr>
+                <w:sz w:val="17"/>
+              </w:rPr>
+              <w:t>7.20 ± 2.51</w:t>
+            </w:r>
+          </w:p>
+        </w:tc>
+        <w:tc>
+          <w:tcPr>
+            <w:tcW w:type="dxa" w:w="1080"/>
           </w:tcPr>
           <w:p>
             <w:r>
@@ -5371,7 +5689,7 @@
         </w:tc>
         <w:tc>
           <w:tcPr>
-            <w:tcW w:type="dxa" w:w="1234"/>
+            <w:tcW w:type="dxa" w:w="1080"/>
           </w:tcPr>
           <w:p>
             <w:r>
@@ -5384,7 +5702,7 @@
         </w:tc>
         <w:tc>
           <w:tcPr>
-            <w:tcW w:type="dxa" w:w="1234"/>
+            <w:tcW w:type="dxa" w:w="1080"/>
           </w:tcPr>
           <w:p>
             <w:r>
@@ -5397,7 +5715,7 @@
         </w:tc>
         <w:tc>
           <w:tcPr>
-            <w:tcW w:type="dxa" w:w="1234"/>
+            <w:tcW w:type="dxa" w:w="1080"/>
           </w:tcPr>
           <w:p>
             <w:r>
@@ -5410,14 +5728,14 @@
         </w:tc>
         <w:tc>
           <w:tcPr>
-            <w:tcW w:type="dxa" w:w="1234"/>
-          </w:tcPr>
-          <w:p>
-            <w:r>
-              <w:rPr>
-                <w:sz w:val="17"/>
-              </w:rPr>
-              <w:t>16</w:t>
+            <w:tcW w:type="dxa" w:w="1080"/>
+          </w:tcPr>
+          <w:p>
+            <w:r>
+              <w:rPr>
+                <w:sz w:val="17"/>
+              </w:rPr>
+              <w:t>0.819</w:t>
             </w:r>
           </w:p>
         </w:tc>
@@ -5430,7 +5748,7 @@
           <w:b/>
           <w:sz w:val="19"/>
         </w:rPr>
-        <w:t>Tabela 9 — Fadiga mental (0–10): pré vs pós por dia</w:t>
+        <w:t>Tabela 9 — Fadiga mental (0–10): pré → mid → pós por dia</w:t>
       </w:r>
     </w:p>
     <w:tbl>
@@ -5441,18 +5759,19 @@
         <w:tblLook w:firstColumn="1" w:firstRow="1" w:lastColumn="0" w:lastRow="0" w:noHBand="0" w:noVBand="1" w:val="04A0"/>
       </w:tblPr>
       <w:tblGrid>
-        <w:gridCol w:w="1234"/>
-        <w:gridCol w:w="1234"/>
-        <w:gridCol w:w="1234"/>
-        <w:gridCol w:w="1234"/>
-        <w:gridCol w:w="1234"/>
-        <w:gridCol w:w="1234"/>
-        <w:gridCol w:w="1234"/>
+        <w:gridCol w:w="1080"/>
+        <w:gridCol w:w="1080"/>
+        <w:gridCol w:w="1080"/>
+        <w:gridCol w:w="1080"/>
+        <w:gridCol w:w="1080"/>
+        <w:gridCol w:w="1080"/>
+        <w:gridCol w:w="1080"/>
+        <w:gridCol w:w="1080"/>
       </w:tblGrid>
       <w:tr>
         <w:tc>
           <w:tcPr>
-            <w:tcW w:type="dxa" w:w="1234"/>
+            <w:tcW w:type="dxa" w:w="1080"/>
           </w:tcPr>
           <w:p>
             <w:r>
@@ -5466,7 +5785,7 @@
         </w:tc>
         <w:tc>
           <w:tcPr>
-            <w:tcW w:type="dxa" w:w="1234"/>
+            <w:tcW w:type="dxa" w:w="1080"/>
           </w:tcPr>
           <w:p>
             <w:r>
@@ -5480,7 +5799,7 @@
         </w:tc>
         <w:tc>
           <w:tcPr>
-            <w:tcW w:type="dxa" w:w="1234"/>
+            <w:tcW w:type="dxa" w:w="1080"/>
           </w:tcPr>
           <w:p>
             <w:r>
@@ -5488,13 +5807,27 @@
                 <w:b/>
                 <w:sz w:val="17"/>
               </w:rPr>
+              <w:t>Mid (m ± DP)</w:t>
+            </w:r>
+          </w:p>
+        </w:tc>
+        <w:tc>
+          <w:tcPr>
+            <w:tcW w:type="dxa" w:w="1080"/>
+          </w:tcPr>
+          <w:p>
+            <w:r>
+              <w:rPr>
+                <w:b/>
+                <w:sz w:val="17"/>
+              </w:rPr>
               <w:t>Pós (m ± DP)</w:t>
             </w:r>
           </w:p>
         </w:tc>
         <w:tc>
           <w:tcPr>
-            <w:tcW w:type="dxa" w:w="1234"/>
+            <w:tcW w:type="dxa" w:w="1080"/>
           </w:tcPr>
           <w:p>
             <w:r>
@@ -5508,7 +5841,7 @@
         </w:tc>
         <w:tc>
           <w:tcPr>
-            <w:tcW w:type="dxa" w:w="1234"/>
+            <w:tcW w:type="dxa" w:w="1080"/>
           </w:tcPr>
           <w:p>
             <w:r>
@@ -5522,7 +5855,7 @@
         </w:tc>
         <w:tc>
           <w:tcPr>
-            <w:tcW w:type="dxa" w:w="1234"/>
+            <w:tcW w:type="dxa" w:w="1080"/>
           </w:tcPr>
           <w:p>
             <w:r>
@@ -5530,13 +5863,13 @@
                 <w:b/>
                 <w:sz w:val="17"/>
               </w:rPr>
-              <w:t>p (Wilcoxon)</w:t>
-            </w:r>
-          </w:p>
-        </w:tc>
-        <w:tc>
-          <w:tcPr>
-            <w:tcW w:type="dxa" w:w="1234"/>
+              <w:t>p pré×pós</w:t>
+            </w:r>
+          </w:p>
+        </w:tc>
+        <w:tc>
+          <w:tcPr>
+            <w:tcW w:type="dxa" w:w="1080"/>
           </w:tcPr>
           <w:p>
             <w:r>
@@ -5544,7 +5877,7 @@
                 <w:b/>
                 <w:sz w:val="17"/>
               </w:rPr>
-              <w:t>n pares</w:t>
+              <w:t>p Friedman</w:t>
             </w:r>
           </w:p>
         </w:tc>
@@ -5552,7 +5885,7 @@
       <w:tr>
         <w:tc>
           <w:tcPr>
-            <w:tcW w:type="dxa" w:w="1234"/>
+            <w:tcW w:type="dxa" w:w="1080"/>
           </w:tcPr>
           <w:p>
             <w:r>
@@ -5565,7 +5898,7 @@
         </w:tc>
         <w:tc>
           <w:tcPr>
-            <w:tcW w:type="dxa" w:w="1234"/>
+            <w:tcW w:type="dxa" w:w="1080"/>
           </w:tcPr>
           <w:p>
             <w:r>
@@ -5578,7 +5911,20 @@
         </w:tc>
         <w:tc>
           <w:tcPr>
-            <w:tcW w:type="dxa" w:w="1234"/>
+            <w:tcW w:type="dxa" w:w="1080"/>
+          </w:tcPr>
+          <w:p>
+            <w:r>
+              <w:rPr>
+                <w:sz w:val="17"/>
+              </w:rPr>
+              <w:t>—</w:t>
+            </w:r>
+          </w:p>
+        </w:tc>
+        <w:tc>
+          <w:tcPr>
+            <w:tcW w:type="dxa" w:w="1080"/>
           </w:tcPr>
           <w:p>
             <w:r>
@@ -5591,7 +5937,7 @@
         </w:tc>
         <w:tc>
           <w:tcPr>
-            <w:tcW w:type="dxa" w:w="1234"/>
+            <w:tcW w:type="dxa" w:w="1080"/>
           </w:tcPr>
           <w:p>
             <w:r>
@@ -5604,7 +5950,7 @@
         </w:tc>
         <w:tc>
           <w:tcPr>
-            <w:tcW w:type="dxa" w:w="1234"/>
+            <w:tcW w:type="dxa" w:w="1080"/>
           </w:tcPr>
           <w:p>
             <w:r>
@@ -5617,7 +5963,7 @@
         </w:tc>
         <w:tc>
           <w:tcPr>
-            <w:tcW w:type="dxa" w:w="1234"/>
+            <w:tcW w:type="dxa" w:w="1080"/>
           </w:tcPr>
           <w:p>
             <w:r>
@@ -5630,14 +5976,14 @@
         </w:tc>
         <w:tc>
           <w:tcPr>
-            <w:tcW w:type="dxa" w:w="1234"/>
-          </w:tcPr>
-          <w:p>
-            <w:r>
-              <w:rPr>
-                <w:sz w:val="17"/>
-              </w:rPr>
-              <w:t>15</w:t>
+            <w:tcW w:type="dxa" w:w="1080"/>
+          </w:tcPr>
+          <w:p>
+            <w:r>
+              <w:rPr>
+                <w:sz w:val="17"/>
+              </w:rPr>
+              <w:t>—</w:t>
             </w:r>
           </w:p>
         </w:tc>
@@ -5645,7 +5991,7 @@
       <w:tr>
         <w:tc>
           <w:tcPr>
-            <w:tcW w:type="dxa" w:w="1234"/>
+            <w:tcW w:type="dxa" w:w="1080"/>
           </w:tcPr>
           <w:p>
             <w:r>
@@ -5658,7 +6004,7 @@
         </w:tc>
         <w:tc>
           <w:tcPr>
-            <w:tcW w:type="dxa" w:w="1234"/>
+            <w:tcW w:type="dxa" w:w="1080"/>
           </w:tcPr>
           <w:p>
             <w:r>
@@ -5671,7 +6017,20 @@
         </w:tc>
         <w:tc>
           <w:tcPr>
-            <w:tcW w:type="dxa" w:w="1234"/>
+            <w:tcW w:type="dxa" w:w="1080"/>
+          </w:tcPr>
+          <w:p>
+            <w:r>
+              <w:rPr>
+                <w:sz w:val="17"/>
+              </w:rPr>
+              <w:t>4.23 ± 2.50</w:t>
+            </w:r>
+          </w:p>
+        </w:tc>
+        <w:tc>
+          <w:tcPr>
+            <w:tcW w:type="dxa" w:w="1080"/>
           </w:tcPr>
           <w:p>
             <w:r>
@@ -5684,7 +6043,7 @@
         </w:tc>
         <w:tc>
           <w:tcPr>
-            <w:tcW w:type="dxa" w:w="1234"/>
+            <w:tcW w:type="dxa" w:w="1080"/>
           </w:tcPr>
           <w:p>
             <w:r>
@@ -5697,7 +6056,7 @@
         </w:tc>
         <w:tc>
           <w:tcPr>
-            <w:tcW w:type="dxa" w:w="1234"/>
+            <w:tcW w:type="dxa" w:w="1080"/>
           </w:tcPr>
           <w:p>
             <w:r>
@@ -5710,7 +6069,7 @@
         </w:tc>
         <w:tc>
           <w:tcPr>
-            <w:tcW w:type="dxa" w:w="1234"/>
+            <w:tcW w:type="dxa" w:w="1080"/>
           </w:tcPr>
           <w:p>
             <w:r>
@@ -5723,14 +6082,14 @@
         </w:tc>
         <w:tc>
           <w:tcPr>
-            <w:tcW w:type="dxa" w:w="1234"/>
-          </w:tcPr>
-          <w:p>
-            <w:r>
-              <w:rPr>
-                <w:sz w:val="17"/>
-              </w:rPr>
-              <w:t>26</w:t>
+            <w:tcW w:type="dxa" w:w="1080"/>
+          </w:tcPr>
+          <w:p>
+            <w:r>
+              <w:rPr>
+                <w:sz w:val="17"/>
+              </w:rPr>
+              <w:t>0.773</w:t>
             </w:r>
           </w:p>
         </w:tc>
@@ -5738,7 +6097,7 @@
       <w:tr>
         <w:tc>
           <w:tcPr>
-            <w:tcW w:type="dxa" w:w="1234"/>
+            <w:tcW w:type="dxa" w:w="1080"/>
           </w:tcPr>
           <w:p>
             <w:r>
@@ -5751,7 +6110,7 @@
         </w:tc>
         <w:tc>
           <w:tcPr>
-            <w:tcW w:type="dxa" w:w="1234"/>
+            <w:tcW w:type="dxa" w:w="1080"/>
           </w:tcPr>
           <w:p>
             <w:r>
@@ -5764,7 +6123,20 @@
         </w:tc>
         <w:tc>
           <w:tcPr>
-            <w:tcW w:type="dxa" w:w="1234"/>
+            <w:tcW w:type="dxa" w:w="1080"/>
+          </w:tcPr>
+          <w:p>
+            <w:r>
+              <w:rPr>
+                <w:sz w:val="17"/>
+              </w:rPr>
+              <w:t>4.61 ± 3.11</w:t>
+            </w:r>
+          </w:p>
+        </w:tc>
+        <w:tc>
+          <w:tcPr>
+            <w:tcW w:type="dxa" w:w="1080"/>
           </w:tcPr>
           <w:p>
             <w:r>
@@ -5777,7 +6149,7 @@
         </w:tc>
         <w:tc>
           <w:tcPr>
-            <w:tcW w:type="dxa" w:w="1234"/>
+            <w:tcW w:type="dxa" w:w="1080"/>
           </w:tcPr>
           <w:p>
             <w:r>
@@ -5790,7 +6162,7 @@
         </w:tc>
         <w:tc>
           <w:tcPr>
-            <w:tcW w:type="dxa" w:w="1234"/>
+            <w:tcW w:type="dxa" w:w="1080"/>
           </w:tcPr>
           <w:p>
             <w:r>
@@ -5803,7 +6175,7 @@
         </w:tc>
         <w:tc>
           <w:tcPr>
-            <w:tcW w:type="dxa" w:w="1234"/>
+            <w:tcW w:type="dxa" w:w="1080"/>
           </w:tcPr>
           <w:p>
             <w:r>
@@ -5816,14 +6188,14 @@
         </w:tc>
         <w:tc>
           <w:tcPr>
-            <w:tcW w:type="dxa" w:w="1234"/>
-          </w:tcPr>
-          <w:p>
-            <w:r>
-              <w:rPr>
-                <w:sz w:val="17"/>
-              </w:rPr>
-              <w:t>21</w:t>
+            <w:tcW w:type="dxa" w:w="1080"/>
+          </w:tcPr>
+          <w:p>
+            <w:r>
+              <w:rPr>
+                <w:sz w:val="17"/>
+              </w:rPr>
+              <w:t>0.067</w:t>
             </w:r>
           </w:p>
         </w:tc>
@@ -5831,7 +6203,7 @@
       <w:tr>
         <w:tc>
           <w:tcPr>
-            <w:tcW w:type="dxa" w:w="1234"/>
+            <w:tcW w:type="dxa" w:w="1080"/>
           </w:tcPr>
           <w:p>
             <w:r>
@@ -5844,7 +6216,7 @@
         </w:tc>
         <w:tc>
           <w:tcPr>
-            <w:tcW w:type="dxa" w:w="1234"/>
+            <w:tcW w:type="dxa" w:w="1080"/>
           </w:tcPr>
           <w:p>
             <w:r>
@@ -5857,7 +6229,20 @@
         </w:tc>
         <w:tc>
           <w:tcPr>
-            <w:tcW w:type="dxa" w:w="1234"/>
+            <w:tcW w:type="dxa" w:w="1080"/>
+          </w:tcPr>
+          <w:p>
+            <w:r>
+              <w:rPr>
+                <w:sz w:val="17"/>
+              </w:rPr>
+              <w:t>5.10 ± 2.40</w:t>
+            </w:r>
+          </w:p>
+        </w:tc>
+        <w:tc>
+          <w:tcPr>
+            <w:tcW w:type="dxa" w:w="1080"/>
           </w:tcPr>
           <w:p>
             <w:r>
@@ -5870,7 +6255,7 @@
         </w:tc>
         <w:tc>
           <w:tcPr>
-            <w:tcW w:type="dxa" w:w="1234"/>
+            <w:tcW w:type="dxa" w:w="1080"/>
           </w:tcPr>
           <w:p>
             <w:r>
@@ -5883,7 +6268,7 @@
         </w:tc>
         <w:tc>
           <w:tcPr>
-            <w:tcW w:type="dxa" w:w="1234"/>
+            <w:tcW w:type="dxa" w:w="1080"/>
           </w:tcPr>
           <w:p>
             <w:r>
@@ -5896,7 +6281,7 @@
         </w:tc>
         <w:tc>
           <w:tcPr>
-            <w:tcW w:type="dxa" w:w="1234"/>
+            <w:tcW w:type="dxa" w:w="1080"/>
           </w:tcPr>
           <w:p>
             <w:r>
@@ -5909,14 +6294,14 @@
         </w:tc>
         <w:tc>
           <w:tcPr>
-            <w:tcW w:type="dxa" w:w="1234"/>
-          </w:tcPr>
-          <w:p>
-            <w:r>
-              <w:rPr>
-                <w:sz w:val="17"/>
-              </w:rPr>
-              <w:t>18</w:t>
+            <w:tcW w:type="dxa" w:w="1080"/>
+          </w:tcPr>
+          <w:p>
+            <w:r>
+              <w:rPr>
+                <w:sz w:val="17"/>
+              </w:rPr>
+              <w:t>0.581</w:t>
             </w:r>
           </w:p>
         </w:tc>
@@ -5924,7 +6309,7 @@
       <w:tr>
         <w:tc>
           <w:tcPr>
-            <w:tcW w:type="dxa" w:w="1234"/>
+            <w:tcW w:type="dxa" w:w="1080"/>
           </w:tcPr>
           <w:p>
             <w:r>
@@ -5937,7 +6322,7 @@
         </w:tc>
         <w:tc>
           <w:tcPr>
-            <w:tcW w:type="dxa" w:w="1234"/>
+            <w:tcW w:type="dxa" w:w="1080"/>
           </w:tcPr>
           <w:p>
             <w:r>
@@ -5950,7 +6335,20 @@
         </w:tc>
         <w:tc>
           <w:tcPr>
-            <w:tcW w:type="dxa" w:w="1234"/>
+            <w:tcW w:type="dxa" w:w="1080"/>
+          </w:tcPr>
+          <w:p>
+            <w:r>
+              <w:rPr>
+                <w:sz w:val="17"/>
+              </w:rPr>
+              <w:t>3.78 ± 2.59</w:t>
+            </w:r>
+          </w:p>
+        </w:tc>
+        <w:tc>
+          <w:tcPr>
+            <w:tcW w:type="dxa" w:w="1080"/>
           </w:tcPr>
           <w:p>
             <w:r>
@@ -5963,7 +6361,7 @@
         </w:tc>
         <w:tc>
           <w:tcPr>
-            <w:tcW w:type="dxa" w:w="1234"/>
+            <w:tcW w:type="dxa" w:w="1080"/>
           </w:tcPr>
           <w:p>
             <w:r>
@@ -5976,7 +6374,7 @@
         </w:tc>
         <w:tc>
           <w:tcPr>
-            <w:tcW w:type="dxa" w:w="1234"/>
+            <w:tcW w:type="dxa" w:w="1080"/>
           </w:tcPr>
           <w:p>
             <w:r>
@@ -5989,7 +6387,7 @@
         </w:tc>
         <w:tc>
           <w:tcPr>
-            <w:tcW w:type="dxa" w:w="1234"/>
+            <w:tcW w:type="dxa" w:w="1080"/>
           </w:tcPr>
           <w:p>
             <w:r>
@@ -6002,14 +6400,14 @@
         </w:tc>
         <w:tc>
           <w:tcPr>
-            <w:tcW w:type="dxa" w:w="1234"/>
-          </w:tcPr>
-          <w:p>
-            <w:r>
-              <w:rPr>
-                <w:sz w:val="17"/>
-              </w:rPr>
-              <w:t>19</w:t>
+            <w:tcW w:type="dxa" w:w="1080"/>
+          </w:tcPr>
+          <w:p>
+            <w:r>
+              <w:rPr>
+                <w:sz w:val="17"/>
+              </w:rPr>
+              <w:t>0.509</w:t>
             </w:r>
           </w:p>
         </w:tc>
@@ -6017,7 +6415,7 @@
       <w:tr>
         <w:tc>
           <w:tcPr>
-            <w:tcW w:type="dxa" w:w="1234"/>
+            <w:tcW w:type="dxa" w:w="1080"/>
           </w:tcPr>
           <w:p>
             <w:r>
@@ -6030,7 +6428,7 @@
         </w:tc>
         <w:tc>
           <w:tcPr>
-            <w:tcW w:type="dxa" w:w="1234"/>
+            <w:tcW w:type="dxa" w:w="1080"/>
           </w:tcPr>
           <w:p>
             <w:r>
@@ -6043,7 +6441,20 @@
         </w:tc>
         <w:tc>
           <w:tcPr>
-            <w:tcW w:type="dxa" w:w="1234"/>
+            <w:tcW w:type="dxa" w:w="1080"/>
+          </w:tcPr>
+          <w:p>
+            <w:r>
+              <w:rPr>
+                <w:sz w:val="17"/>
+              </w:rPr>
+              <w:t>4.28 ± 3.06</w:t>
+            </w:r>
+          </w:p>
+        </w:tc>
+        <w:tc>
+          <w:tcPr>
+            <w:tcW w:type="dxa" w:w="1080"/>
           </w:tcPr>
           <w:p>
             <w:r>
@@ -6056,7 +6467,7 @@
         </w:tc>
         <w:tc>
           <w:tcPr>
-            <w:tcW w:type="dxa" w:w="1234"/>
+            <w:tcW w:type="dxa" w:w="1080"/>
           </w:tcPr>
           <w:p>
             <w:r>
@@ -6069,7 +6480,7 @@
         </w:tc>
         <w:tc>
           <w:tcPr>
-            <w:tcW w:type="dxa" w:w="1234"/>
+            <w:tcW w:type="dxa" w:w="1080"/>
           </w:tcPr>
           <w:p>
             <w:r>
@@ -6082,7 +6493,7 @@
         </w:tc>
         <w:tc>
           <w:tcPr>
-            <w:tcW w:type="dxa" w:w="1234"/>
+            <w:tcW w:type="dxa" w:w="1080"/>
           </w:tcPr>
           <w:p>
             <w:r>
@@ -6095,14 +6506,14 @@
         </w:tc>
         <w:tc>
           <w:tcPr>
-            <w:tcW w:type="dxa" w:w="1234"/>
-          </w:tcPr>
-          <w:p>
-            <w:r>
-              <w:rPr>
-                <w:sz w:val="17"/>
-              </w:rPr>
-              <w:t>20</w:t>
+            <w:tcW w:type="dxa" w:w="1080"/>
+          </w:tcPr>
+          <w:p>
+            <w:r>
+              <w:rPr>
+                <w:sz w:val="17"/>
+              </w:rPr>
+              <w:t>0.135</w:t>
             </w:r>
           </w:p>
         </w:tc>
@@ -6110,7 +6521,7 @@
       <w:tr>
         <w:tc>
           <w:tcPr>
-            <w:tcW w:type="dxa" w:w="1234"/>
+            <w:tcW w:type="dxa" w:w="1080"/>
           </w:tcPr>
           <w:p>
             <w:r>
@@ -6123,7 +6534,7 @@
         </w:tc>
         <w:tc>
           <w:tcPr>
-            <w:tcW w:type="dxa" w:w="1234"/>
+            <w:tcW w:type="dxa" w:w="1080"/>
           </w:tcPr>
           <w:p>
             <w:r>
@@ -6136,7 +6547,20 @@
         </w:tc>
         <w:tc>
           <w:tcPr>
-            <w:tcW w:type="dxa" w:w="1234"/>
+            <w:tcW w:type="dxa" w:w="1080"/>
+          </w:tcPr>
+          <w:p>
+            <w:r>
+              <w:rPr>
+                <w:sz w:val="17"/>
+              </w:rPr>
+              <w:t>5.70 ± 2.49</w:t>
+            </w:r>
+          </w:p>
+        </w:tc>
+        <w:tc>
+          <w:tcPr>
+            <w:tcW w:type="dxa" w:w="1080"/>
           </w:tcPr>
           <w:p>
             <w:r>
@@ -6149,7 +6573,7 @@
         </w:tc>
         <w:tc>
           <w:tcPr>
-            <w:tcW w:type="dxa" w:w="1234"/>
+            <w:tcW w:type="dxa" w:w="1080"/>
           </w:tcPr>
           <w:p>
             <w:r>
@@ -6162,7 +6586,7 @@
         </w:tc>
         <w:tc>
           <w:tcPr>
-            <w:tcW w:type="dxa" w:w="1234"/>
+            <w:tcW w:type="dxa" w:w="1080"/>
           </w:tcPr>
           <w:p>
             <w:r>
@@ -6175,7 +6599,7 @@
         </w:tc>
         <w:tc>
           <w:tcPr>
-            <w:tcW w:type="dxa" w:w="1234"/>
+            <w:tcW w:type="dxa" w:w="1080"/>
           </w:tcPr>
           <w:p>
             <w:r>
@@ -6188,14 +6612,14 @@
         </w:tc>
         <w:tc>
           <w:tcPr>
-            <w:tcW w:type="dxa" w:w="1234"/>
-          </w:tcPr>
-          <w:p>
-            <w:r>
-              <w:rPr>
-                <w:sz w:val="17"/>
-              </w:rPr>
-              <w:t>16</w:t>
+            <w:tcW w:type="dxa" w:w="1080"/>
+          </w:tcPr>
+          <w:p>
+            <w:r>
+              <w:rPr>
+                <w:sz w:val="17"/>
+              </w:rPr>
+              <w:t>0.801</w:t>
             </w:r>
           </w:p>
         </w:tc>
@@ -6208,7 +6632,7 @@
           <w:b w:val="0"/>
           <w:i w:val="0"/>
         </w:rPr>
-        <w:t>Padrão comum às quatro variáveis: a maior resposta aguda pré→pós ocorre no Dia 1 (a primeira sessão, efeito de novidade/choque inicial) e reaparece na segunda metade da semana (D6–D7). O Vigor cai (Δ negativo) e Fadiga/TMD/Fadiga mental sobem (Δ positivo) após o treino. Nem todo dia atinge significância pareada — a resposta aguda isolada é modesta; o sinal robusto está no acúmulo semanal (§2) e não na sessão isolada, coerente com a AUC ≈ 0,5 para discriminar a sessão de HIIT vs 0,86 para o acúmulo.</w:t>
+        <w:t>A fase mid (intra-sessão) mostra que a resposta não é sempre monotônica pré→pós. Em várias variáveis o mid já é mais alto que o pré (a fadiga sobe durante a sessão) e por vezes supera o pós — sinal de um pico intra-sessão com recuperação parcial ao final (p.ex. Fadiga BRUMS no D7: pré 6,8 → mid 8,6 → pós 7,8; TMD no D4: pré 3,1 → mid 7,1 → pós 7,2). O padrão geral persiste: a maior resposta aguda ocorre no Dia 1 (choque inicial) e reaparece no fim da semana (D6–D7); o Vigor cai e Fadiga/TMD/Fadiga mental sobem. Nem todo dia atinge significância — o sinal robusto está no acúmulo semanal (§2), não na sessão isolada (AUC ≈ 0,5 para a sessão vs 0,86 para o acúmulo).</w:t>
       </w:r>
     </w:p>
     <w:p>
@@ -6259,7 +6683,7 @@
           <w:i/>
           <w:sz w:val="17"/>
         </w:rPr>
-        <w:t>Fig 6 — Pré (azul) vs pós por dia, média ± DP, para cada variável. * marca os dias com Wilcoxon pareado p&lt;0,05. O Vigor diminui e Fadiga/TMD/Fadiga mental aumentam pós-treino; a resposta é mais nítida no D1 e no fim da semana.</w:t>
+        <w:t>Fig 6 — Pré (azul) → mid (cinza, intra-sessão) → pós por dia, para cada variável. * marca os dias com Wilcoxon pareado pré×pós p&lt;0,05. O mid revela o curso intra-sessão: a fadiga frequentemente pica no meio e recua um pouco ao final.</w:t>
       </w:r>
     </w:p>
     <w:p>

</xml_diff>